<commit_message>
ran R coords 15x15 1-6. also adding code for acc vs complexity charts with error bars
</commit_message>
<xml_diff>
--- a/3x3_score_investigation.docx
+++ b/3x3_score_investigation.docx
@@ -56,51 +56,151 @@
           <w:szCs w:val="12"/>
           <w:lang w:val="en-US"/>
         </w:rPr>
+        <w:t xml:space="preserve"> = [100.0, 100.0, 100.0, 100.0, 100.0, 100.0, 100.0, 100.0, 100.0, 100.0]</w:t>
+      </w:r>
+    </w:p>
+    <w:p>
+      <w:pPr>
+        <w:rPr>
+          <w:color w:val="EE0000"/>
+          <w:sz w:val="12"/>
+          <w:szCs w:val="12"/>
+        </w:rPr>
+      </w:pPr>
+      <w:proofErr w:type="spellStart"/>
+      <w:r>
+        <w:rPr>
+          <w:sz w:val="12"/>
+          <w:szCs w:val="12"/>
+        </w:rPr>
+        <w:t>line_adj_txt</w:t>
+      </w:r>
+      <w:proofErr w:type="spellEnd"/>
+      <w:r>
+        <w:rPr>
+          <w:sz w:val="12"/>
+          <w:szCs w:val="12"/>
+        </w:rPr>
         <w:t xml:space="preserve"> = </w:t>
       </w:r>
       <w:r>
         <w:rPr>
-          <w:color w:val="45B0E1" w:themeColor="accent1" w:themeTint="99"/>
-          <w:sz w:val="12"/>
-          <w:szCs w:val="12"/>
-          <w:lang w:val="en-US"/>
+          <w:sz w:val="12"/>
+          <w:szCs w:val="12"/>
         </w:rPr>
         <w:t>[</w:t>
       </w:r>
       <w:r>
         <w:rPr>
-          <w:color w:val="45B0E1" w:themeColor="accent1" w:themeTint="99"/>
-          <w:sz w:val="12"/>
-          <w:szCs w:val="12"/>
-          <w:lang w:val="en-US"/>
-        </w:rPr>
-        <w:t>100.0, 100.0, 100.0, 100.0, 100.0, 100.0, 100.0, 100.0, 100.0, 100.0</w:t>
-      </w:r>
-      <w:r>
-        <w:rPr>
-          <w:color w:val="45B0E1" w:themeColor="accent1" w:themeTint="99"/>
-          <w:sz w:val="12"/>
-          <w:szCs w:val="12"/>
-          <w:lang w:val="en-US"/>
+          <w:sz w:val="12"/>
+          <w:szCs w:val="12"/>
+        </w:rPr>
+        <w:t>100.0, 100.0, 100.0, 100.0, 100.0, 100.0, 100.0</w:t>
+      </w:r>
+      <w:r>
+        <w:rPr>
+          <w:color w:val="EE0000"/>
+          <w:sz w:val="12"/>
+          <w:szCs w:val="12"/>
+        </w:rPr>
+        <w:t>, 42.857142857142854</w:t>
+      </w:r>
+      <w:r>
+        <w:rPr>
+          <w:sz w:val="12"/>
+          <w:szCs w:val="12"/>
+        </w:rPr>
+        <w:t>, 100.0, 100.0</w:t>
+      </w:r>
+      <w:r>
+        <w:rPr>
+          <w:sz w:val="12"/>
+          <w:szCs w:val="12"/>
         </w:rPr>
         <w:t>]</w:t>
       </w:r>
-    </w:p>
-    <w:p>
-      <w:pPr>
-        <w:rPr>
-          <w:color w:val="EE0000"/>
-          <w:sz w:val="12"/>
-          <w:szCs w:val="12"/>
-        </w:rPr>
-      </w:pPr>
-      <w:proofErr w:type="spellStart"/>
-      <w:r>
-        <w:rPr>
-          <w:sz w:val="12"/>
-          <w:szCs w:val="12"/>
-        </w:rPr>
-        <w:t>line_adj_txt</w:t>
+      <w:r>
+        <w:rPr>
+          <w:sz w:val="12"/>
+          <w:szCs w:val="12"/>
+        </w:rPr>
+        <w:t xml:space="preserve"> </w:t>
+      </w:r>
+      <w:r>
+        <w:rPr>
+          <w:color w:val="EE0000"/>
+          <w:sz w:val="12"/>
+          <w:szCs w:val="12"/>
+        </w:rPr>
+        <w:t xml:space="preserve">ik kan deze niet verklaren, hij snijdt gewoon een stuk af door </w:t>
+      </w:r>
+      <w:proofErr w:type="spellStart"/>
+      <w:r>
+        <w:rPr>
+          <w:color w:val="EE0000"/>
+          <w:sz w:val="12"/>
+          <w:szCs w:val="12"/>
+        </w:rPr>
+        <w:t>door</w:t>
+      </w:r>
+      <w:proofErr w:type="spellEnd"/>
+      <w:r>
+        <w:rPr>
+          <w:color w:val="EE0000"/>
+          <w:sz w:val="12"/>
+          <w:szCs w:val="12"/>
+        </w:rPr>
+        <w:t xml:space="preserve"> een muur heen te lopen.</w:t>
+      </w:r>
+    </w:p>
+    <w:p>
+      <w:pPr>
+        <w:rPr>
+          <w:sz w:val="12"/>
+          <w:szCs w:val="12"/>
+        </w:rPr>
+      </w:pPr>
+      <w:proofErr w:type="spellStart"/>
+      <w:r>
+        <w:rPr>
+          <w:sz w:val="12"/>
+          <w:szCs w:val="12"/>
+        </w:rPr>
+        <w:t>line_jpg</w:t>
+      </w:r>
+      <w:proofErr w:type="spellEnd"/>
+      <w:r>
+        <w:rPr>
+          <w:sz w:val="12"/>
+          <w:szCs w:val="12"/>
+        </w:rPr>
+        <w:t xml:space="preserve"> = [40.0, 20.0, 40.0, 60.0</w:t>
+      </w:r>
+      <w:commentRangeStart w:id="0"/>
+      <w:r>
+        <w:rPr>
+          <w:sz w:val="12"/>
+          <w:szCs w:val="12"/>
+        </w:rPr>
+        <w:t>, 42.857142857142854, 100.0, 20.0, 14.285714285714285, 42.857142857142854, 20.0]</w:t>
+      </w:r>
+    </w:p>
+    <w:p>
+      <w:pPr>
+        <w:rPr>
+          <w:color w:val="EE0000"/>
+          <w:sz w:val="12"/>
+          <w:szCs w:val="12"/>
+          <w:lang w:val="en-US"/>
+        </w:rPr>
+      </w:pPr>
+      <w:proofErr w:type="spellStart"/>
+      <w:r>
+        <w:rPr>
+          <w:sz w:val="12"/>
+          <w:szCs w:val="12"/>
+        </w:rPr>
+        <w:t>line_json</w:t>
       </w:r>
       <w:proofErr w:type="spellEnd"/>
       <w:r>
@@ -122,22 +222,7 @@
           <w:sz w:val="12"/>
           <w:szCs w:val="12"/>
         </w:rPr>
-        <w:t>100.0, 100.0, 100.0, 100.0, 100.0, 100.0, 100.0</w:t>
-      </w:r>
-      <w:r>
-        <w:rPr>
-          <w:color w:val="EE0000"/>
-          <w:sz w:val="12"/>
-          <w:szCs w:val="12"/>
-        </w:rPr>
-        <w:t>, 42.857142857142854</w:t>
-      </w:r>
-      <w:r>
-        <w:rPr>
-          <w:sz w:val="12"/>
-          <w:szCs w:val="12"/>
-        </w:rPr>
-        <w:t>, 100.0, 100.0</w:t>
+        <w:t>100.0, 20.0, 60.0, 20.0, 42.857142857142854, 100.0, 20.0, 14.285714285714285, 42.857142857142854, 20.0</w:t>
       </w:r>
       <w:r>
         <w:rPr>
@@ -146,6 +231,13 @@
         </w:rPr>
         <w:t>]</w:t>
       </w:r>
+      <w:commentRangeEnd w:id="0"/>
+      <w:r>
+        <w:rPr>
+          <w:rStyle w:val="CommentReference"/>
+        </w:rPr>
+        <w:commentReference w:id="0"/>
+      </w:r>
       <w:r>
         <w:rPr>
           <w:sz w:val="12"/>
@@ -159,50 +251,183 @@
           <w:sz w:val="12"/>
           <w:szCs w:val="12"/>
         </w:rPr>
-        <w:t xml:space="preserve">ik kan deze niet verklaren, hij snijdt gewoon een stuk af door </w:t>
-      </w:r>
-      <w:proofErr w:type="spellStart"/>
-      <w:r>
-        <w:rPr>
-          <w:color w:val="EE0000"/>
-          <w:sz w:val="12"/>
-          <w:szCs w:val="12"/>
-        </w:rPr>
-        <w:t>door</w:t>
-      </w:r>
-      <w:proofErr w:type="spellEnd"/>
-      <w:r>
-        <w:rPr>
-          <w:color w:val="EE0000"/>
-          <w:sz w:val="12"/>
-          <w:szCs w:val="12"/>
-        </w:rPr>
-        <w:t xml:space="preserve"> een muur heen te lopen.</w:t>
-      </w:r>
-    </w:p>
-    <w:p>
-      <w:pPr>
-        <w:rPr>
-          <w:sz w:val="12"/>
-          <w:szCs w:val="12"/>
-          <w:lang w:val="en-US"/>
-        </w:rPr>
-      </w:pPr>
-      <w:proofErr w:type="spellStart"/>
-      <w:r>
-        <w:rPr>
-          <w:sz w:val="12"/>
-          <w:szCs w:val="12"/>
-          <w:lang w:val="en-US"/>
-        </w:rPr>
-        <w:t>line_jpg</w:t>
-      </w:r>
-      <w:proofErr w:type="spellEnd"/>
-      <w:r>
-        <w:rPr>
-          <w:sz w:val="12"/>
-          <w:szCs w:val="12"/>
-          <w:lang w:val="en-US"/>
+        <w:t xml:space="preserve">runs 7/8/10: verschillende antwoorden, zelfde score.  </w:t>
+      </w:r>
+      <w:proofErr w:type="spellStart"/>
+      <w:r>
+        <w:rPr>
+          <w:color w:val="EE0000"/>
+          <w:sz w:val="12"/>
+          <w:szCs w:val="12"/>
+          <w:lang w:val="en-US"/>
+        </w:rPr>
+        <w:t>Misschien</w:t>
+      </w:r>
+      <w:proofErr w:type="spellEnd"/>
+      <w:r>
+        <w:rPr>
+          <w:color w:val="EE0000"/>
+          <w:sz w:val="12"/>
+          <w:szCs w:val="12"/>
+          <w:lang w:val="en-US"/>
+        </w:rPr>
+        <w:t xml:space="preserve"> </w:t>
+      </w:r>
+      <w:proofErr w:type="spellStart"/>
+      <w:r>
+        <w:rPr>
+          <w:color w:val="EE0000"/>
+          <w:sz w:val="12"/>
+          <w:szCs w:val="12"/>
+          <w:lang w:val="en-US"/>
+        </w:rPr>
+        <w:t>toeval</w:t>
+      </w:r>
+      <w:proofErr w:type="spellEnd"/>
+      <w:r>
+        <w:rPr>
+          <w:color w:val="EE0000"/>
+          <w:sz w:val="12"/>
+          <w:szCs w:val="12"/>
+          <w:lang w:val="en-US"/>
+        </w:rPr>
+        <w:t xml:space="preserve">. </w:t>
+      </w:r>
+    </w:p>
+    <w:p>
+      <w:pPr>
+        <w:rPr>
+          <w:sz w:val="12"/>
+          <w:szCs w:val="12"/>
+          <w:lang w:val="en-US"/>
+        </w:rPr>
+      </w:pPr>
+      <w:proofErr w:type="spellStart"/>
+      <w:r>
+        <w:rPr>
+          <w:sz w:val="12"/>
+          <w:szCs w:val="12"/>
+          <w:lang w:val="en-US"/>
+        </w:rPr>
+        <w:t>line_tokenized_txt</w:t>
+      </w:r>
+      <w:proofErr w:type="spellEnd"/>
+      <w:r>
+        <w:rPr>
+          <w:sz w:val="12"/>
+          <w:szCs w:val="12"/>
+          <w:lang w:val="en-US"/>
+        </w:rPr>
+        <w:t xml:space="preserve"> = [20.0, 0.0, 0.0, 60.0, 0.0, 0.0, 0.0, 14.285714285714285, 0.0, 20.0]</w:t>
+      </w:r>
+    </w:p>
+    <w:p>
+      <w:pPr>
+        <w:rPr>
+          <w:color w:val="45B0E1" w:themeColor="accent1" w:themeTint="99"/>
+          <w:sz w:val="12"/>
+          <w:szCs w:val="12"/>
+          <w:lang w:val="en-US"/>
+        </w:rPr>
+      </w:pPr>
+      <w:proofErr w:type="spellStart"/>
+      <w:r>
+        <w:rPr>
+          <w:color w:val="45B0E1" w:themeColor="accent1" w:themeTint="99"/>
+          <w:sz w:val="12"/>
+          <w:szCs w:val="12"/>
+          <w:lang w:val="en-US"/>
+        </w:rPr>
+        <w:t>occupancy_adj_json</w:t>
+      </w:r>
+      <w:proofErr w:type="spellEnd"/>
+      <w:r>
+        <w:rPr>
+          <w:color w:val="45B0E1" w:themeColor="accent1" w:themeTint="99"/>
+          <w:sz w:val="12"/>
+          <w:szCs w:val="12"/>
+          <w:lang w:val="en-US"/>
+        </w:rPr>
+        <w:t xml:space="preserve"> = [100.0, 100.0, 100.0, 100.0, 100.0, 100.0, 100.0, 100.0, 100.0, 100.0]</w:t>
+      </w:r>
+    </w:p>
+    <w:p>
+      <w:pPr>
+        <w:rPr>
+          <w:color w:val="45B0E1" w:themeColor="accent1" w:themeTint="99"/>
+          <w:sz w:val="12"/>
+          <w:szCs w:val="12"/>
+          <w:lang w:val="en-US"/>
+        </w:rPr>
+      </w:pPr>
+      <w:proofErr w:type="spellStart"/>
+      <w:r>
+        <w:rPr>
+          <w:color w:val="45B0E1" w:themeColor="accent1" w:themeTint="99"/>
+          <w:sz w:val="12"/>
+          <w:szCs w:val="12"/>
+          <w:lang w:val="en-US"/>
+        </w:rPr>
+        <w:t>occupancy_adj_txt</w:t>
+      </w:r>
+      <w:proofErr w:type="spellEnd"/>
+      <w:r>
+        <w:rPr>
+          <w:color w:val="45B0E1" w:themeColor="accent1" w:themeTint="99"/>
+          <w:sz w:val="12"/>
+          <w:szCs w:val="12"/>
+          <w:lang w:val="en-US"/>
+        </w:rPr>
+        <w:t xml:space="preserve"> = [100.0, 100.0, 100.0, 100.0, 100.0, 100.0, 100.0, 100.0, 100.0, 100.0]</w:t>
+      </w:r>
+    </w:p>
+    <w:p>
+      <w:pPr>
+        <w:rPr>
+          <w:color w:val="D86DCB" w:themeColor="accent5" w:themeTint="99"/>
+          <w:sz w:val="12"/>
+          <w:szCs w:val="12"/>
+        </w:rPr>
+      </w:pPr>
+      <w:proofErr w:type="spellStart"/>
+      <w:r>
+        <w:rPr>
+          <w:color w:val="D86DCB" w:themeColor="accent5" w:themeTint="99"/>
+          <w:sz w:val="12"/>
+          <w:szCs w:val="12"/>
+        </w:rPr>
+        <w:t>occupancy_ascii_txt</w:t>
+      </w:r>
+      <w:proofErr w:type="spellEnd"/>
+      <w:r>
+        <w:rPr>
+          <w:color w:val="D86DCB" w:themeColor="accent5" w:themeTint="99"/>
+          <w:sz w:val="12"/>
+          <w:szCs w:val="12"/>
+        </w:rPr>
+        <w:t xml:space="preserve"> = [0.0, 110.00000000000001, 0.0, 110.00000000000001, 0.0, 0.0, 0.0, 0.0, 0.0, 110.00000000000001]</w:t>
+      </w:r>
+    </w:p>
+    <w:p>
+      <w:pPr>
+        <w:rPr>
+          <w:sz w:val="12"/>
+          <w:szCs w:val="12"/>
+        </w:rPr>
+      </w:pPr>
+      <w:proofErr w:type="spellStart"/>
+      <w:r>
+        <w:rPr>
+          <w:sz w:val="12"/>
+          <w:szCs w:val="12"/>
+        </w:rPr>
+        <w:t>occupancy_jpg</w:t>
+      </w:r>
+      <w:proofErr w:type="spellEnd"/>
+      <w:r>
+        <w:rPr>
+          <w:sz w:val="12"/>
+          <w:szCs w:val="12"/>
         </w:rPr>
         <w:t xml:space="preserve"> = </w:t>
       </w:r>
@@ -210,7 +435,6 @@
         <w:rPr>
           <w:sz w:val="12"/>
           <w:szCs w:val="12"/>
-          <w:lang w:val="en-US"/>
         </w:rPr>
         <w:t>[</w:t>
       </w:r>
@@ -218,431 +442,91 @@
         <w:rPr>
           <w:sz w:val="12"/>
           <w:szCs w:val="12"/>
-          <w:lang w:val="en-US"/>
-        </w:rPr>
-        <w:t>40.0, 20.0, 40.0, 60.0</w:t>
-      </w:r>
-      <w:commentRangeStart w:id="0"/>
-      <w:r>
-        <w:rPr>
-          <w:sz w:val="12"/>
-          <w:szCs w:val="12"/>
-          <w:lang w:val="en-US"/>
-        </w:rPr>
-        <w:t>, 42.857142857142854, 100.0, 20.0, 14.285714285714285, 42.857142857142854, 20.0</w:t>
-      </w:r>
-      <w:r>
-        <w:rPr>
-          <w:sz w:val="12"/>
-          <w:szCs w:val="12"/>
-          <w:lang w:val="en-US"/>
+        </w:rPr>
+        <w:t>0.0, 0.0</w:t>
+      </w:r>
+      <w:r>
+        <w:rPr>
+          <w:color w:val="EE0000"/>
+          <w:sz w:val="12"/>
+          <w:szCs w:val="12"/>
+        </w:rPr>
+        <w:t xml:space="preserve">, 55.55555555555556, </w:t>
+      </w:r>
+      <w:r>
+        <w:rPr>
+          <w:sz w:val="12"/>
+          <w:szCs w:val="12"/>
+        </w:rPr>
+        <w:t>0.0, 0.0, 0.0, 0.0, 0.0, 0.0, 0.0</w:t>
+      </w:r>
+      <w:r>
+        <w:rPr>
+          <w:sz w:val="12"/>
+          <w:szCs w:val="12"/>
         </w:rPr>
         <w:t>]</w:t>
       </w:r>
-    </w:p>
-    <w:p>
-      <w:pPr>
-        <w:rPr>
-          <w:color w:val="EE0000"/>
-          <w:sz w:val="12"/>
-          <w:szCs w:val="12"/>
-        </w:rPr>
-      </w:pPr>
-      <w:proofErr w:type="spellStart"/>
-      <w:r>
-        <w:rPr>
-          <w:sz w:val="12"/>
-          <w:szCs w:val="12"/>
-        </w:rPr>
-        <w:t>line_json</w:t>
-      </w:r>
-      <w:proofErr w:type="spellEnd"/>
-      <w:r>
-        <w:rPr>
-          <w:sz w:val="12"/>
-          <w:szCs w:val="12"/>
-        </w:rPr>
-        <w:t xml:space="preserve"> = </w:t>
-      </w:r>
-      <w:r>
-        <w:rPr>
-          <w:sz w:val="12"/>
-          <w:szCs w:val="12"/>
-        </w:rPr>
-        <w:t>[</w:t>
-      </w:r>
-      <w:r>
-        <w:rPr>
-          <w:sz w:val="12"/>
-          <w:szCs w:val="12"/>
-        </w:rPr>
-        <w:t>100.0, 20.0, 60.0, 20.0, 42.857142857142854, 100.0, 20.0, 14.285714285714285, 42.857142857142854, 20.0</w:t>
-      </w:r>
-      <w:r>
-        <w:rPr>
-          <w:sz w:val="12"/>
-          <w:szCs w:val="12"/>
+      <w:r>
+        <w:rPr>
+          <w:sz w:val="12"/>
+          <w:szCs w:val="12"/>
+        </w:rPr>
+        <w:t xml:space="preserve"> </w:t>
+      </w:r>
+      <w:r>
+        <w:rPr>
+          <w:color w:val="EE0000"/>
+          <w:sz w:val="12"/>
+          <w:szCs w:val="12"/>
+        </w:rPr>
+        <w:t xml:space="preserve">geen geheel random antwoord. Volgt de eerste aantal stappen netjes het pad. </w:t>
+      </w:r>
+      <w:r>
+        <w:rPr>
+          <w:color w:val="EE0000"/>
+          <w:sz w:val="12"/>
+          <w:szCs w:val="12"/>
+        </w:rPr>
+        <w:t>Wel verkeerd eindpunt.</w:t>
+      </w:r>
+    </w:p>
+    <w:p>
+      <w:pPr>
+        <w:rPr>
+          <w:sz w:val="12"/>
+          <w:szCs w:val="12"/>
+          <w:lang w:val="en-US"/>
+        </w:rPr>
+      </w:pPr>
+      <w:proofErr w:type="spellStart"/>
+      <w:r>
+        <w:rPr>
+          <w:color w:val="D86DCB" w:themeColor="accent5" w:themeTint="99"/>
+          <w:sz w:val="12"/>
+          <w:szCs w:val="12"/>
+          <w:lang w:val="en-US"/>
+        </w:rPr>
+        <w:t>occupancy_json</w:t>
+      </w:r>
+      <w:proofErr w:type="spellEnd"/>
+      <w:r>
+        <w:rPr>
+          <w:color w:val="D86DCB" w:themeColor="accent5" w:themeTint="99"/>
+          <w:sz w:val="12"/>
+          <w:szCs w:val="12"/>
+          <w:lang w:val="en-US"/>
+        </w:rPr>
+        <w:t xml:space="preserve"> = [100.0, 110.00000000000001, 100.0, 110.00000000000001, 7.6923076923076925, 100.0, 110.00000000000001, 100.0, 100.0, 110.00000000000001</w:t>
+      </w:r>
+      <w:r>
+        <w:rPr>
+          <w:sz w:val="12"/>
+          <w:szCs w:val="12"/>
+          <w:lang w:val="en-US"/>
         </w:rPr>
         <w:t>]</w:t>
       </w:r>
-      <w:commentRangeEnd w:id="0"/>
-      <w:r>
-        <w:rPr>
-          <w:rStyle w:val="CommentReference"/>
-        </w:rPr>
-        <w:commentReference w:id="0"/>
-      </w:r>
-      <w:r>
-        <w:rPr>
-          <w:sz w:val="12"/>
-          <w:szCs w:val="12"/>
-        </w:rPr>
-        <w:t xml:space="preserve"> </w:t>
-      </w:r>
-      <w:r>
-        <w:rPr>
-          <w:color w:val="EE0000"/>
-          <w:sz w:val="12"/>
-          <w:szCs w:val="12"/>
-        </w:rPr>
-        <w:t xml:space="preserve">runs 7/8/10: verschillende antwoorden, zelfde score.  Misschien toeval. </w:t>
-      </w:r>
-    </w:p>
-    <w:p>
-      <w:pPr>
-        <w:rPr>
-          <w:sz w:val="12"/>
-          <w:szCs w:val="12"/>
-          <w:lang w:val="en-US"/>
-        </w:rPr>
-      </w:pPr>
-      <w:proofErr w:type="spellStart"/>
-      <w:r>
-        <w:rPr>
-          <w:sz w:val="12"/>
-          <w:szCs w:val="12"/>
-          <w:lang w:val="en-US"/>
-        </w:rPr>
-        <w:t>line_tokenized_txt</w:t>
-      </w:r>
-      <w:proofErr w:type="spellEnd"/>
-      <w:r>
-        <w:rPr>
-          <w:sz w:val="12"/>
-          <w:szCs w:val="12"/>
-          <w:lang w:val="en-US"/>
-        </w:rPr>
-        <w:t xml:space="preserve"> = </w:t>
-      </w:r>
-      <w:r>
-        <w:rPr>
-          <w:sz w:val="12"/>
-          <w:szCs w:val="12"/>
-          <w:lang w:val="en-US"/>
-        </w:rPr>
-        <w:t>[</w:t>
-      </w:r>
-      <w:r>
-        <w:rPr>
-          <w:sz w:val="12"/>
-          <w:szCs w:val="12"/>
-          <w:lang w:val="en-US"/>
-        </w:rPr>
-        <w:t>20.0, 0.0, 0.0, 60.0, 0.0, 0.0, 0.0, 14.285714285714285, 0.0, 20.0</w:t>
-      </w:r>
-      <w:r>
-        <w:rPr>
-          <w:sz w:val="12"/>
-          <w:szCs w:val="12"/>
-          <w:lang w:val="en-US"/>
-        </w:rPr>
-        <w:t>]</w:t>
-      </w:r>
-    </w:p>
-    <w:p>
-      <w:pPr>
-        <w:rPr>
-          <w:color w:val="45B0E1" w:themeColor="accent1" w:themeTint="99"/>
-          <w:sz w:val="12"/>
-          <w:szCs w:val="12"/>
-          <w:lang w:val="en-US"/>
-        </w:rPr>
-      </w:pPr>
-      <w:proofErr w:type="spellStart"/>
-      <w:r>
-        <w:rPr>
-          <w:color w:val="45B0E1" w:themeColor="accent1" w:themeTint="99"/>
-          <w:sz w:val="12"/>
-          <w:szCs w:val="12"/>
-          <w:lang w:val="en-US"/>
-        </w:rPr>
-        <w:t>occupancy_adj_json</w:t>
-      </w:r>
-      <w:proofErr w:type="spellEnd"/>
-      <w:r>
-        <w:rPr>
-          <w:color w:val="45B0E1" w:themeColor="accent1" w:themeTint="99"/>
-          <w:sz w:val="12"/>
-          <w:szCs w:val="12"/>
-          <w:lang w:val="en-US"/>
-        </w:rPr>
-        <w:t xml:space="preserve"> = </w:t>
-      </w:r>
-      <w:r>
-        <w:rPr>
-          <w:color w:val="45B0E1" w:themeColor="accent1" w:themeTint="99"/>
-          <w:sz w:val="12"/>
-          <w:szCs w:val="12"/>
-          <w:lang w:val="en-US"/>
-        </w:rPr>
-        <w:t>[</w:t>
-      </w:r>
-      <w:r>
-        <w:rPr>
-          <w:color w:val="45B0E1" w:themeColor="accent1" w:themeTint="99"/>
-          <w:sz w:val="12"/>
-          <w:szCs w:val="12"/>
-          <w:lang w:val="en-US"/>
-        </w:rPr>
-        <w:t>100.0, 100.0, 100.0, 100.0, 100.0, 100.0, 100.0, 100.0, 100.0, 100.0</w:t>
-      </w:r>
-      <w:r>
-        <w:rPr>
-          <w:color w:val="45B0E1" w:themeColor="accent1" w:themeTint="99"/>
-          <w:sz w:val="12"/>
-          <w:szCs w:val="12"/>
-          <w:lang w:val="en-US"/>
-        </w:rPr>
-        <w:t>]</w:t>
-      </w:r>
-    </w:p>
-    <w:p>
-      <w:pPr>
-        <w:rPr>
-          <w:color w:val="45B0E1" w:themeColor="accent1" w:themeTint="99"/>
-          <w:sz w:val="12"/>
-          <w:szCs w:val="12"/>
-          <w:lang w:val="en-US"/>
-        </w:rPr>
-      </w:pPr>
-      <w:proofErr w:type="spellStart"/>
-      <w:r>
-        <w:rPr>
-          <w:color w:val="45B0E1" w:themeColor="accent1" w:themeTint="99"/>
-          <w:sz w:val="12"/>
-          <w:szCs w:val="12"/>
-          <w:lang w:val="en-US"/>
-        </w:rPr>
-        <w:t>occupancy_adj_txt</w:t>
-      </w:r>
-      <w:proofErr w:type="spellEnd"/>
-      <w:r>
-        <w:rPr>
-          <w:color w:val="45B0E1" w:themeColor="accent1" w:themeTint="99"/>
-          <w:sz w:val="12"/>
-          <w:szCs w:val="12"/>
-          <w:lang w:val="en-US"/>
-        </w:rPr>
-        <w:t xml:space="preserve"> = </w:t>
-      </w:r>
-      <w:r>
-        <w:rPr>
-          <w:color w:val="45B0E1" w:themeColor="accent1" w:themeTint="99"/>
-          <w:sz w:val="12"/>
-          <w:szCs w:val="12"/>
-          <w:lang w:val="en-US"/>
-        </w:rPr>
-        <w:t>[</w:t>
-      </w:r>
-      <w:r>
-        <w:rPr>
-          <w:color w:val="45B0E1" w:themeColor="accent1" w:themeTint="99"/>
-          <w:sz w:val="12"/>
-          <w:szCs w:val="12"/>
-          <w:lang w:val="en-US"/>
-        </w:rPr>
-        <w:t>100.0, 100.0, 100.0, 100.0, 100.0, 100.0, 100.0, 100.0, 100.0, 100.0</w:t>
-      </w:r>
-      <w:r>
-        <w:rPr>
-          <w:color w:val="45B0E1" w:themeColor="accent1" w:themeTint="99"/>
-          <w:sz w:val="12"/>
-          <w:szCs w:val="12"/>
-          <w:lang w:val="en-US"/>
-        </w:rPr>
-        <w:t>]</w:t>
-      </w:r>
-    </w:p>
-    <w:p>
-      <w:pPr>
-        <w:rPr>
-          <w:sz w:val="12"/>
-          <w:szCs w:val="12"/>
-          <w:lang w:val="en-US"/>
-        </w:rPr>
-      </w:pPr>
-      <w:proofErr w:type="spellStart"/>
-      <w:r>
-        <w:rPr>
-          <w:sz w:val="12"/>
-          <w:szCs w:val="12"/>
-          <w:lang w:val="en-US"/>
-        </w:rPr>
-        <w:t>occupancy_ascii_txt</w:t>
-      </w:r>
-      <w:proofErr w:type="spellEnd"/>
-      <w:r>
-        <w:rPr>
-          <w:sz w:val="12"/>
-          <w:szCs w:val="12"/>
-          <w:lang w:val="en-US"/>
-        </w:rPr>
-        <w:t xml:space="preserve"> = </w:t>
-      </w:r>
-      <w:r>
-        <w:rPr>
-          <w:sz w:val="12"/>
-          <w:szCs w:val="12"/>
-          <w:lang w:val="en-US"/>
-        </w:rPr>
-        <w:t>[</w:t>
-      </w:r>
-      <w:r>
-        <w:rPr>
-          <w:sz w:val="12"/>
-          <w:szCs w:val="12"/>
-          <w:lang w:val="en-US"/>
-        </w:rPr>
-        <w:t>0.0, 110.00000000000001, 0.0, 110.00000000000001, 0.0, 0.0, 0.0, 0.0, 0.0, 110.00000000000001</w:t>
-      </w:r>
-      <w:r>
-        <w:rPr>
-          <w:sz w:val="12"/>
-          <w:szCs w:val="12"/>
-          <w:lang w:val="en-US"/>
-        </w:rPr>
-        <w:t>]</w:t>
-      </w:r>
-    </w:p>
-    <w:p>
-      <w:pPr>
-        <w:rPr>
-          <w:sz w:val="12"/>
-          <w:szCs w:val="12"/>
-        </w:rPr>
-      </w:pPr>
-      <w:proofErr w:type="spellStart"/>
-      <w:r>
-        <w:rPr>
-          <w:sz w:val="12"/>
-          <w:szCs w:val="12"/>
-        </w:rPr>
-        <w:t>occupancy_jpg</w:t>
-      </w:r>
-      <w:proofErr w:type="spellEnd"/>
-      <w:r>
-        <w:rPr>
-          <w:sz w:val="12"/>
-          <w:szCs w:val="12"/>
-        </w:rPr>
-        <w:t xml:space="preserve"> = </w:t>
-      </w:r>
-      <w:r>
-        <w:rPr>
-          <w:sz w:val="12"/>
-          <w:szCs w:val="12"/>
-        </w:rPr>
-        <w:t>[</w:t>
-      </w:r>
-      <w:r>
-        <w:rPr>
-          <w:sz w:val="12"/>
-          <w:szCs w:val="12"/>
-        </w:rPr>
-        <w:t>0.0, 0.0</w:t>
-      </w:r>
-      <w:r>
-        <w:rPr>
-          <w:color w:val="EE0000"/>
-          <w:sz w:val="12"/>
-          <w:szCs w:val="12"/>
-        </w:rPr>
-        <w:t xml:space="preserve">, 55.55555555555556, </w:t>
-      </w:r>
-      <w:r>
-        <w:rPr>
-          <w:sz w:val="12"/>
-          <w:szCs w:val="12"/>
-        </w:rPr>
-        <w:t>0.0, 0.0, 0.0, 0.0, 0.0, 0.0, 0.0</w:t>
-      </w:r>
-      <w:r>
-        <w:rPr>
-          <w:sz w:val="12"/>
-          <w:szCs w:val="12"/>
-        </w:rPr>
-        <w:t>]</w:t>
-      </w:r>
-      <w:r>
-        <w:rPr>
-          <w:sz w:val="12"/>
-          <w:szCs w:val="12"/>
-        </w:rPr>
-        <w:t xml:space="preserve"> </w:t>
-      </w:r>
-      <w:r>
-        <w:rPr>
-          <w:color w:val="EE0000"/>
-          <w:sz w:val="12"/>
-          <w:szCs w:val="12"/>
-        </w:rPr>
-        <w:t xml:space="preserve">geen geheel random antwoord. Volgt de eerste aantal stappen netjes het pad. </w:t>
-      </w:r>
-    </w:p>
-    <w:p>
-      <w:pPr>
-        <w:rPr>
-          <w:sz w:val="12"/>
-          <w:szCs w:val="12"/>
-        </w:rPr>
-      </w:pPr>
-      <w:proofErr w:type="spellStart"/>
-      <w:r>
-        <w:rPr>
-          <w:sz w:val="12"/>
-          <w:szCs w:val="12"/>
-        </w:rPr>
-        <w:t>occupancy_json</w:t>
-      </w:r>
-      <w:proofErr w:type="spellEnd"/>
-      <w:r>
-        <w:rPr>
-          <w:sz w:val="12"/>
-          <w:szCs w:val="12"/>
-        </w:rPr>
-        <w:t xml:space="preserve"> = </w:t>
-      </w:r>
-      <w:r>
-        <w:rPr>
-          <w:sz w:val="12"/>
-          <w:szCs w:val="12"/>
-        </w:rPr>
-        <w:t>[</w:t>
-      </w:r>
-      <w:r>
-        <w:rPr>
-          <w:sz w:val="12"/>
-          <w:szCs w:val="12"/>
-        </w:rPr>
-        <w:t>100.0, 110.00000000000001, 100.0, 110.00000000000001, 7.6923076923076925, 100.0, 110.00000000000001, 100.0, 100.0, 110.00000000000001</w:t>
-      </w:r>
-      <w:r>
-        <w:rPr>
-          <w:sz w:val="12"/>
-          <w:szCs w:val="12"/>
-        </w:rPr>
-        <w:t>]</w:t>
-      </w:r>
     </w:p>
     <w:p>
       <w:pPr>
@@ -668,31 +552,7 @@
           <w:szCs w:val="12"/>
           <w:lang w:val="en-US"/>
         </w:rPr>
-        <w:t xml:space="preserve"> = </w:t>
-      </w:r>
-      <w:r>
-        <w:rPr>
-          <w:sz w:val="12"/>
-          <w:szCs w:val="12"/>
-          <w:lang w:val="en-US"/>
-        </w:rPr>
-        <w:t>[</w:t>
-      </w:r>
-      <w:r>
-        <w:rPr>
-          <w:sz w:val="12"/>
-          <w:szCs w:val="12"/>
-          <w:lang w:val="en-US"/>
-        </w:rPr>
-        <w:t>11.11111111111111, 110.00000000000001, 100.0, 100.0, 7.6923076923076925, 11.11111111111111, 100.0, 100.0, 7.6923076923076925, 110.00000000000001</w:t>
-      </w:r>
-      <w:r>
-        <w:rPr>
-          <w:sz w:val="12"/>
-          <w:szCs w:val="12"/>
-          <w:lang w:val="en-US"/>
-        </w:rPr>
-        <w:t>]</w:t>
+        <w:t xml:space="preserve"> = [11.11111111111111, 110.00000000000001, 100.0, 100.0, 7.6923076923076925, 11.11111111111111, 100.0, 100.0, 7.6923076923076925, 110.00000000000001]</w:t>
       </w:r>
     </w:p>
     <w:p>
@@ -749,13 +609,61 @@
           <w:szCs w:val="12"/>
           <w:lang w:val="en-US"/>
         </w:rPr>
+        <w:t xml:space="preserve"> = [0.0, 0.0, 100.0, 100.0, 33.33333333333333, 100.0, 100.0, 33.33333333333333, 33.33333333333333, 100.0]</w:t>
+      </w:r>
+    </w:p>
+    <w:p>
+      <w:pPr>
+        <w:rPr>
+          <w:sz w:val="12"/>
+          <w:szCs w:val="12"/>
+        </w:rPr>
+      </w:pPr>
+      <w:proofErr w:type="spellStart"/>
+      <w:r>
+        <w:rPr>
+          <w:sz w:val="12"/>
+          <w:szCs w:val="12"/>
+        </w:rPr>
+        <w:t>line_adj_txt</w:t>
+      </w:r>
+      <w:proofErr w:type="spellEnd"/>
+      <w:r>
+        <w:rPr>
+          <w:sz w:val="12"/>
+          <w:szCs w:val="12"/>
+        </w:rPr>
+        <w:t xml:space="preserve"> = [0.0, 100.0, 0.0, 100.0, 0.0, 0.0, 100.0, 33.33333333333333, 33.33333333333333, 100.0]</w:t>
+      </w:r>
+    </w:p>
+    <w:p>
+      <w:pPr>
+        <w:rPr>
+          <w:color w:val="EE0000"/>
+          <w:sz w:val="12"/>
+          <w:szCs w:val="12"/>
+        </w:rPr>
+      </w:pPr>
+      <w:proofErr w:type="spellStart"/>
+      <w:r>
+        <w:rPr>
+          <w:sz w:val="12"/>
+          <w:szCs w:val="12"/>
+        </w:rPr>
+        <w:t>line_jpg</w:t>
+      </w:r>
+      <w:proofErr w:type="spellEnd"/>
+      <w:r>
+        <w:rPr>
+          <w:sz w:val="12"/>
+          <w:szCs w:val="12"/>
+        </w:rPr>
         <w:t xml:space="preserve"> = </w:t>
       </w:r>
       <w:r>
         <w:rPr>
           <w:sz w:val="12"/>
           <w:szCs w:val="12"/>
-          <w:lang w:val="en-US"/>
         </w:rPr>
         <w:t>[</w:t>
       </w:r>
@@ -763,137 +671,38 @@
         <w:rPr>
           <w:sz w:val="12"/>
           <w:szCs w:val="12"/>
-          <w:lang w:val="en-US"/>
-        </w:rPr>
-        <w:t>0.0, 0.0, 100.0, 100.0, 33.33333333333333, 100.0, 100.0, 33.33333333333333, 33.33333333333333, 100.0</w:t>
-      </w:r>
-      <w:r>
-        <w:rPr>
-          <w:sz w:val="12"/>
-          <w:szCs w:val="12"/>
-          <w:lang w:val="en-US"/>
+        </w:rPr>
+        <w:t xml:space="preserve">50.0, 0.0, 50.0, </w:t>
+      </w:r>
+      <w:commentRangeStart w:id="1"/>
+      <w:r>
+        <w:rPr>
+          <w:sz w:val="12"/>
+          <w:szCs w:val="12"/>
+        </w:rPr>
+        <w:t>100.0</w:t>
+      </w:r>
+      <w:commentRangeEnd w:id="1"/>
+      <w:r>
+        <w:rPr>
+          <w:rStyle w:val="CommentReference"/>
+        </w:rPr>
+        <w:commentReference w:id="1"/>
+      </w:r>
+      <w:r>
+        <w:rPr>
+          <w:sz w:val="12"/>
+          <w:szCs w:val="12"/>
+        </w:rPr>
+        <w:t>, 33.33333333333333, 50.0, 100.0, 0.0, 0.0, 0.0</w:t>
+      </w:r>
+      <w:r>
+        <w:rPr>
+          <w:sz w:val="12"/>
+          <w:szCs w:val="12"/>
         </w:rPr>
         <w:t>]</w:t>
       </w:r>
-    </w:p>
-    <w:p>
-      <w:pPr>
-        <w:rPr>
-          <w:sz w:val="12"/>
-          <w:szCs w:val="12"/>
-          <w:lang w:val="en-US"/>
-        </w:rPr>
-      </w:pPr>
-      <w:proofErr w:type="spellStart"/>
-      <w:r>
-        <w:rPr>
-          <w:sz w:val="12"/>
-          <w:szCs w:val="12"/>
-          <w:lang w:val="en-US"/>
-        </w:rPr>
-        <w:t>line_adj_txt</w:t>
-      </w:r>
-      <w:proofErr w:type="spellEnd"/>
-      <w:r>
-        <w:rPr>
-          <w:sz w:val="12"/>
-          <w:szCs w:val="12"/>
-          <w:lang w:val="en-US"/>
-        </w:rPr>
-        <w:t xml:space="preserve"> = </w:t>
-      </w:r>
-      <w:r>
-        <w:rPr>
-          <w:sz w:val="12"/>
-          <w:szCs w:val="12"/>
-          <w:lang w:val="en-US"/>
-        </w:rPr>
-        <w:t>[</w:t>
-      </w:r>
-      <w:r>
-        <w:rPr>
-          <w:sz w:val="12"/>
-          <w:szCs w:val="12"/>
-          <w:lang w:val="en-US"/>
-        </w:rPr>
-        <w:t>0.0, 100.0, 0.0, 100.0, 0.0, 0.0, 100.0, 33.33333333333333, 33.33333333333333, 100.0</w:t>
-      </w:r>
-      <w:r>
-        <w:rPr>
-          <w:sz w:val="12"/>
-          <w:szCs w:val="12"/>
-          <w:lang w:val="en-US"/>
-        </w:rPr>
-        <w:t>]</w:t>
-      </w:r>
-    </w:p>
-    <w:p>
-      <w:pPr>
-        <w:rPr>
-          <w:color w:val="EE0000"/>
-          <w:sz w:val="12"/>
-          <w:szCs w:val="12"/>
-        </w:rPr>
-      </w:pPr>
-      <w:proofErr w:type="spellStart"/>
-      <w:r>
-        <w:rPr>
-          <w:sz w:val="12"/>
-          <w:szCs w:val="12"/>
-        </w:rPr>
-        <w:t>line_jpg</w:t>
-      </w:r>
-      <w:proofErr w:type="spellEnd"/>
-      <w:r>
-        <w:rPr>
-          <w:sz w:val="12"/>
-          <w:szCs w:val="12"/>
-        </w:rPr>
-        <w:t xml:space="preserve"> = </w:t>
-      </w:r>
-      <w:r>
-        <w:rPr>
-          <w:sz w:val="12"/>
-          <w:szCs w:val="12"/>
-        </w:rPr>
-        <w:t>[</w:t>
-      </w:r>
-      <w:r>
-        <w:rPr>
-          <w:sz w:val="12"/>
-          <w:szCs w:val="12"/>
-        </w:rPr>
-        <w:t xml:space="preserve">50.0, 0.0, 50.0, </w:t>
-      </w:r>
-      <w:commentRangeStart w:id="1"/>
-      <w:r>
-        <w:rPr>
-          <w:sz w:val="12"/>
-          <w:szCs w:val="12"/>
-        </w:rPr>
-        <w:t>100.0</w:t>
-      </w:r>
-      <w:commentRangeEnd w:id="1"/>
-      <w:r>
-        <w:rPr>
-          <w:rStyle w:val="CommentReference"/>
-        </w:rPr>
-        <w:commentReference w:id="1"/>
-      </w:r>
-      <w:r>
-        <w:rPr>
-          <w:sz w:val="12"/>
-          <w:szCs w:val="12"/>
-        </w:rPr>
-        <w:t>, 33.33333333333333, 50.0, 100.0, 0.0, 0.0, 0.0</w:t>
-      </w:r>
-      <w:r>
-        <w:rPr>
-          <w:sz w:val="12"/>
-          <w:szCs w:val="12"/>
-        </w:rPr>
-        <w:t>]</w:t>
-      </w:r>
       <w:r>
         <w:rPr>
           <w:sz w:val="12"/>
@@ -915,15 +724,13 @@
         <w:rPr>
           <w:sz w:val="12"/>
           <w:szCs w:val="12"/>
-          <w:lang w:val="en-US"/>
-        </w:rPr>
-      </w:pPr>
-      <w:proofErr w:type="spellStart"/>
-      <w:r>
-        <w:rPr>
-          <w:sz w:val="12"/>
-          <w:szCs w:val="12"/>
-          <w:lang w:val="en-US"/>
+        </w:rPr>
+      </w:pPr>
+      <w:proofErr w:type="spellStart"/>
+      <w:r>
+        <w:rPr>
+          <w:sz w:val="12"/>
+          <w:szCs w:val="12"/>
         </w:rPr>
         <w:t>line_json</w:t>
       </w:r>
@@ -932,49 +739,22 @@
         <w:rPr>
           <w:sz w:val="12"/>
           <w:szCs w:val="12"/>
-          <w:lang w:val="en-US"/>
-        </w:rPr>
-        <w:t xml:space="preserve"> = </w:t>
-      </w:r>
-      <w:r>
-        <w:rPr>
-          <w:sz w:val="12"/>
-          <w:szCs w:val="12"/>
-          <w:lang w:val="en-US"/>
-        </w:rPr>
-        <w:t>[</w:t>
-      </w:r>
-      <w:r>
-        <w:rPr>
-          <w:sz w:val="12"/>
-          <w:szCs w:val="12"/>
-          <w:lang w:val="en-US"/>
-        </w:rPr>
-        <w:t>100.0, 0.0, 100.0, 0.0, 33.33333333333333, 100.0, 0.0, 0.0, 33.33333333333333, 0.0</w:t>
-      </w:r>
-      <w:r>
-        <w:rPr>
-          <w:sz w:val="12"/>
-          <w:szCs w:val="12"/>
-          <w:lang w:val="en-US"/>
-        </w:rPr>
-        <w:t>]</w:t>
-      </w:r>
-    </w:p>
-    <w:p>
-      <w:pPr>
-        <w:rPr>
-          <w:sz w:val="12"/>
-          <w:szCs w:val="12"/>
-          <w:lang w:val="en-US"/>
-        </w:rPr>
-      </w:pPr>
-      <w:proofErr w:type="spellStart"/>
-      <w:r>
-        <w:rPr>
-          <w:sz w:val="12"/>
-          <w:szCs w:val="12"/>
-          <w:lang w:val="en-US"/>
+        </w:rPr>
+        <w:t xml:space="preserve"> = [100.0, 0.0, 100.0, 0.0, 33.33333333333333, 100.0, 0.0, 0.0, 33.33333333333333, 0.0]</w:t>
+      </w:r>
+    </w:p>
+    <w:p>
+      <w:pPr>
+        <w:rPr>
+          <w:sz w:val="12"/>
+          <w:szCs w:val="12"/>
+        </w:rPr>
+      </w:pPr>
+      <w:proofErr w:type="spellStart"/>
+      <w:r>
+        <w:rPr>
+          <w:sz w:val="12"/>
+          <w:szCs w:val="12"/>
         </w:rPr>
         <w:t>line_tokenized_txt</w:t>
       </w:r>
@@ -983,33 +763,8 @@
         <w:rPr>
           <w:sz w:val="12"/>
           <w:szCs w:val="12"/>
-          <w:lang w:val="en-US"/>
-        </w:rPr>
-        <w:t xml:space="preserve"> = </w:t>
-      </w:r>
-      <w:r>
-        <w:rPr>
-          <w:sz w:val="12"/>
-          <w:szCs w:val="12"/>
-          <w:lang w:val="en-US"/>
-        </w:rPr>
-        <w:t>[</w:t>
-      </w:r>
-      <w:r>
-        <w:rPr>
-          <w:sz w:val="12"/>
-          <w:szCs w:val="12"/>
-          <w:lang w:val="en-US"/>
-        </w:rPr>
-        <w:t>0.0, 100.0, 0.0, 25.0, 0.0, 0.0, 25.0, 33.33333333333333, 0.0, 25.0</w:t>
-      </w:r>
-      <w:r>
-        <w:rPr>
-          <w:sz w:val="12"/>
-          <w:szCs w:val="12"/>
-          <w:lang w:val="en-US"/>
-        </w:rPr>
-        <w:t>]</w:t>
+        </w:rPr>
+        <w:t xml:space="preserve"> = [0.0, 100.0, 0.0, 25.0, 0.0, 0.0, 25.0, 33.33333333333333, 0.0, 25.0]</w:t>
       </w:r>
     </w:p>
     <w:p>
@@ -1036,31 +791,7 @@
           <w:szCs w:val="12"/>
           <w:lang w:val="en-US"/>
         </w:rPr>
-        <w:t xml:space="preserve"> = </w:t>
-      </w:r>
-      <w:r>
-        <w:rPr>
-          <w:sz w:val="12"/>
-          <w:szCs w:val="12"/>
-          <w:lang w:val="en-US"/>
-        </w:rPr>
-        <w:t>[</w:t>
-      </w:r>
-      <w:r>
-        <w:rPr>
-          <w:sz w:val="12"/>
-          <w:szCs w:val="12"/>
-          <w:lang w:val="en-US"/>
-        </w:rPr>
-        <w:t>50.0, 25.0, 75.0, 110.00000000000001, 0.0, 50.0, 110.00000000000001, 33.33333333333333, 0.0, 110.00000000000001</w:t>
-      </w:r>
-      <w:r>
-        <w:rPr>
-          <w:sz w:val="12"/>
-          <w:szCs w:val="12"/>
-          <w:lang w:val="en-US"/>
-        </w:rPr>
-        <w:t>]</w:t>
+        <w:t xml:space="preserve"> = [50.0, 25.0, 75.0, 110.00000000000001, 0.0, 50.0, 110.00000000000001, 33.33333333333333, 0.0, 110.00000000000001]</w:t>
       </w:r>
     </w:p>
     <w:p>
@@ -1087,31 +818,7 @@
           <w:szCs w:val="12"/>
           <w:lang w:val="en-US"/>
         </w:rPr>
-        <w:t xml:space="preserve"> = </w:t>
-      </w:r>
-      <w:r>
-        <w:rPr>
-          <w:sz w:val="12"/>
-          <w:szCs w:val="12"/>
-          <w:lang w:val="en-US"/>
-        </w:rPr>
-        <w:t>[</w:t>
-      </w:r>
-      <w:r>
-        <w:rPr>
-          <w:sz w:val="12"/>
-          <w:szCs w:val="12"/>
-          <w:lang w:val="en-US"/>
-        </w:rPr>
-        <w:t>62.5, 25.0, 0.0, 37.5, 33.33333333333333, 25.0, 37.5, 33.33333333333333, 0.0, 110.00000000000001</w:t>
-      </w:r>
-      <w:r>
-        <w:rPr>
-          <w:sz w:val="12"/>
-          <w:szCs w:val="12"/>
-          <w:lang w:val="en-US"/>
-        </w:rPr>
-        <w:t>]</w:t>
+        <w:t xml:space="preserve"> = [62.5, 25.0, 0.0, 37.5, 33.33333333333333, 25.0, 37.5, 33.33333333333333, 0.0, 110.00000000000001]</w:t>
       </w:r>
     </w:p>
     <w:p>
@@ -1138,31 +845,7 @@
           <w:szCs w:val="12"/>
           <w:lang w:val="en-US"/>
         </w:rPr>
-        <w:t xml:space="preserve"> = </w:t>
-      </w:r>
-      <w:r>
-        <w:rPr>
-          <w:sz w:val="12"/>
-          <w:szCs w:val="12"/>
-          <w:lang w:val="en-US"/>
-        </w:rPr>
-        <w:t>[</w:t>
-      </w:r>
-      <w:r>
-        <w:rPr>
-          <w:sz w:val="12"/>
-          <w:szCs w:val="12"/>
-          <w:lang w:val="en-US"/>
-        </w:rPr>
-        <w:t>0.0, 110.00000000000001, 0.0, 0.0, 0.0, 0.0, 62.5, 33.33333333333333, 33.33333333333333, 0.0</w:t>
-      </w:r>
-      <w:r>
-        <w:rPr>
-          <w:sz w:val="12"/>
-          <w:szCs w:val="12"/>
-          <w:lang w:val="en-US"/>
-        </w:rPr>
-        <w:t>]</w:t>
+        <w:t xml:space="preserve"> = [0.0, 110.00000000000001, 0.0, 0.0, 0.0, 0.0, 62.5, 33.33333333333333, 33.33333333333333, 0.0]</w:t>
       </w:r>
     </w:p>
     <w:p>
@@ -1189,31 +872,7 @@
           <w:szCs w:val="12"/>
           <w:lang w:val="en-US"/>
         </w:rPr>
-        <w:t xml:space="preserve"> = </w:t>
-      </w:r>
-      <w:r>
-        <w:rPr>
-          <w:sz w:val="12"/>
-          <w:szCs w:val="12"/>
-          <w:lang w:val="en-US"/>
-        </w:rPr>
-        <w:t>[</w:t>
-      </w:r>
-      <w:r>
-        <w:rPr>
-          <w:sz w:val="12"/>
-          <w:szCs w:val="12"/>
-          <w:lang w:val="en-US"/>
-        </w:rPr>
-        <w:t>12.5, 0.0, 12.5, 0.0, 8.333333333333332, 12.5, 12.5, 8.333333333333332, 8.333333333333332, 0.0</w:t>
-      </w:r>
-      <w:r>
-        <w:rPr>
-          <w:sz w:val="12"/>
-          <w:szCs w:val="12"/>
-          <w:lang w:val="en-US"/>
-        </w:rPr>
-        <w:t>]</w:t>
+        <w:t xml:space="preserve"> = [12.5, 0.0, 12.5, 0.0, 8.333333333333332, 12.5, 12.5, 8.333333333333332, 8.333333333333332, 0.0]</w:t>
       </w:r>
     </w:p>
     <w:p>
@@ -1240,31 +899,7 @@
           <w:szCs w:val="12"/>
           <w:lang w:val="en-US"/>
         </w:rPr>
-        <w:t xml:space="preserve"> = </w:t>
-      </w:r>
-      <w:r>
-        <w:rPr>
-          <w:sz w:val="12"/>
-          <w:szCs w:val="12"/>
-          <w:lang w:val="en-US"/>
-        </w:rPr>
-        <w:t>[</w:t>
-      </w:r>
-      <w:r>
-        <w:rPr>
-          <w:sz w:val="12"/>
-          <w:szCs w:val="12"/>
-          <w:lang w:val="en-US"/>
-        </w:rPr>
-        <w:t>62.5, 0.0, 0.0, 0.0, 0.0, 0.0, 0.0, 33.33333333333333, 0.0, 87.5</w:t>
-      </w:r>
-      <w:r>
-        <w:rPr>
-          <w:sz w:val="12"/>
-          <w:szCs w:val="12"/>
-          <w:lang w:val="en-US"/>
-        </w:rPr>
-        <w:t>]</w:t>
+        <w:t xml:space="preserve"> = [62.5, 0.0, 0.0, 0.0, 0.0, 0.0, 0.0, 33.33333333333333, 0.0, 87.5]</w:t>
       </w:r>
     </w:p>
     <w:p>
@@ -1291,31 +926,7 @@
           <w:szCs w:val="12"/>
           <w:lang w:val="en-US"/>
         </w:rPr>
-        <w:t xml:space="preserve"> = </w:t>
-      </w:r>
-      <w:r>
-        <w:rPr>
-          <w:sz w:val="12"/>
-          <w:szCs w:val="12"/>
-          <w:lang w:val="en-US"/>
-        </w:rPr>
-        <w:t>[</w:t>
-      </w:r>
-      <w:r>
-        <w:rPr>
-          <w:sz w:val="12"/>
-          <w:szCs w:val="12"/>
-          <w:lang w:val="en-US"/>
-        </w:rPr>
-        <w:t>0.0, 0.0, 0.0, 50.0, 8.333333333333332, 12.5, 0.0, 8.333333333333332, 0.0, 110.00000000000001</w:t>
-      </w:r>
-      <w:r>
-        <w:rPr>
-          <w:sz w:val="12"/>
-          <w:szCs w:val="12"/>
-          <w:lang w:val="en-US"/>
-        </w:rPr>
-        <w:t>]</w:t>
+        <w:t xml:space="preserve"> = [0.0, 0.0, 0.0, 50.0, 8.333333333333332, 12.5, 0.0, 8.333333333333332, 0.0, 110.00000000000001]</w:t>
       </w:r>
     </w:p>
     <w:p>
@@ -1367,6 +978,7 @@
     <w:p>
       <w:pPr>
         <w:rPr>
+          <w:color w:val="EE0000"/>
           <w:sz w:val="12"/>
           <w:szCs w:val="12"/>
         </w:rPr>
@@ -1379,6 +991,30 @@
         </w:rPr>
         <w:t xml:space="preserve">Kan van al deze rode niks maken, het lijkt wel onzin. </w:t>
       </w:r>
+      <w:r>
+        <w:rPr>
+          <w:color w:val="EE0000"/>
+          <w:sz w:val="12"/>
+          <w:szCs w:val="12"/>
+        </w:rPr>
+        <w:t>Allemaal</w:t>
+      </w:r>
+      <w:r>
+        <w:rPr>
+          <w:color w:val="EE0000"/>
+          <w:sz w:val="12"/>
+          <w:szCs w:val="12"/>
+        </w:rPr>
+        <w:t xml:space="preserve"> zijn 1 stap juist. Dat kan dus gewoon random zijn</w:t>
+      </w:r>
+      <w:r>
+        <w:rPr>
+          <w:color w:val="EE0000"/>
+          <w:sz w:val="12"/>
+          <w:szCs w:val="12"/>
+        </w:rPr>
+        <w:t>.</w:t>
+      </w:r>
     </w:p>
     <w:p>
       <w:pPr>
@@ -1404,10 +1040,83 @@
           <w:szCs w:val="12"/>
           <w:lang w:val="en-US"/>
         </w:rPr>
+        <w:t xml:space="preserve"> = [</w:t>
+      </w:r>
+      <w:r>
+        <w:rPr>
+          <w:color w:val="EE0000"/>
+          <w:sz w:val="12"/>
+          <w:szCs w:val="12"/>
+          <w:lang w:val="en-US"/>
+        </w:rPr>
+        <w:t>25.0</w:t>
+      </w:r>
+      <w:r>
+        <w:rPr>
+          <w:sz w:val="12"/>
+          <w:szCs w:val="12"/>
+          <w:lang w:val="en-US"/>
+        </w:rPr>
+        <w:t xml:space="preserve">, 0.0, </w:t>
+      </w:r>
+      <w:r>
+        <w:rPr>
+          <w:color w:val="EE0000"/>
+          <w:sz w:val="12"/>
+          <w:szCs w:val="12"/>
+          <w:lang w:val="en-US"/>
+        </w:rPr>
+        <w:t>25.0</w:t>
+      </w:r>
+      <w:r>
+        <w:rPr>
+          <w:sz w:val="12"/>
+          <w:szCs w:val="12"/>
+          <w:lang w:val="en-US"/>
+        </w:rPr>
+        <w:t>, 0.0, 0.0, 0.0, 0.0, 0.0, 0.0, 0.0]</w:t>
+      </w:r>
+      <w:r>
+        <w:rPr>
+          <w:sz w:val="12"/>
+          <w:szCs w:val="12"/>
+          <w:lang w:val="en-US"/>
+        </w:rPr>
+        <w:t xml:space="preserve"> </w:t>
+      </w:r>
+    </w:p>
+    <w:p>
+      <w:pPr>
+        <w:rPr>
+          <w:color w:val="45B0E1" w:themeColor="accent1" w:themeTint="99"/>
+          <w:sz w:val="12"/>
+          <w:szCs w:val="12"/>
+          <w:lang w:val="en-US"/>
+        </w:rPr>
+      </w:pPr>
+      <w:proofErr w:type="spellStart"/>
+      <w:r>
+        <w:rPr>
+          <w:color w:val="45B0E1" w:themeColor="accent1" w:themeTint="99"/>
+          <w:sz w:val="12"/>
+          <w:szCs w:val="12"/>
+          <w:lang w:val="en-US"/>
+        </w:rPr>
+        <w:t>line_adj_txt</w:t>
+      </w:r>
+      <w:proofErr w:type="spellEnd"/>
+      <w:r>
+        <w:rPr>
+          <w:color w:val="45B0E1" w:themeColor="accent1" w:themeTint="99"/>
+          <w:sz w:val="12"/>
+          <w:szCs w:val="12"/>
+          <w:lang w:val="en-US"/>
+        </w:rPr>
         <w:t xml:space="preserve"> = </w:t>
       </w:r>
       <w:r>
         <w:rPr>
+          <w:color w:val="45B0E1" w:themeColor="accent1" w:themeTint="99"/>
           <w:sz w:val="12"/>
           <w:szCs w:val="12"/>
           <w:lang w:val="en-US"/>
@@ -1416,6 +1125,108 @@
       </w:r>
       <w:r>
         <w:rPr>
+          <w:color w:val="45B0E1" w:themeColor="accent1" w:themeTint="99"/>
+          <w:sz w:val="12"/>
+          <w:szCs w:val="12"/>
+          <w:lang w:val="en-US"/>
+        </w:rPr>
+        <w:t>0.0, 0.0, 0.0, 0.0, 0.0, 0.0, 0.0, 0.0, 0.0, 0.0</w:t>
+      </w:r>
+      <w:r>
+        <w:rPr>
+          <w:color w:val="45B0E1" w:themeColor="accent1" w:themeTint="99"/>
+          <w:sz w:val="12"/>
+          <w:szCs w:val="12"/>
+          <w:lang w:val="en-US"/>
+        </w:rPr>
+        <w:t>]</w:t>
+      </w:r>
+    </w:p>
+    <w:p>
+      <w:pPr>
+        <w:rPr>
+          <w:color w:val="45B0E1" w:themeColor="accent1" w:themeTint="99"/>
+          <w:sz w:val="12"/>
+          <w:szCs w:val="12"/>
+          <w:lang w:val="en-US"/>
+        </w:rPr>
+      </w:pPr>
+      <w:proofErr w:type="spellStart"/>
+      <w:r>
+        <w:rPr>
+          <w:color w:val="45B0E1" w:themeColor="accent1" w:themeTint="99"/>
+          <w:sz w:val="12"/>
+          <w:szCs w:val="12"/>
+          <w:lang w:val="en-US"/>
+        </w:rPr>
+        <w:t>line_jpg</w:t>
+      </w:r>
+      <w:proofErr w:type="spellEnd"/>
+      <w:r>
+        <w:rPr>
+          <w:color w:val="45B0E1" w:themeColor="accent1" w:themeTint="99"/>
+          <w:sz w:val="12"/>
+          <w:szCs w:val="12"/>
+          <w:lang w:val="en-US"/>
+        </w:rPr>
+        <w:t xml:space="preserve"> = </w:t>
+      </w:r>
+      <w:r>
+        <w:rPr>
+          <w:color w:val="45B0E1" w:themeColor="accent1" w:themeTint="99"/>
+          <w:sz w:val="12"/>
+          <w:szCs w:val="12"/>
+          <w:lang w:val="en-US"/>
+        </w:rPr>
+        <w:t>[</w:t>
+      </w:r>
+      <w:r>
+        <w:rPr>
+          <w:color w:val="45B0E1" w:themeColor="accent1" w:themeTint="99"/>
+          <w:sz w:val="12"/>
+          <w:szCs w:val="12"/>
+          <w:lang w:val="en-US"/>
+        </w:rPr>
+        <w:t>0.0, 0.0, 0.0, 0.0, 0.0, 0.0, 0.0, 0.0, 0.0, 0.0</w:t>
+      </w:r>
+      <w:r>
+        <w:rPr>
+          <w:color w:val="45B0E1" w:themeColor="accent1" w:themeTint="99"/>
+          <w:sz w:val="12"/>
+          <w:szCs w:val="12"/>
+          <w:lang w:val="en-US"/>
+        </w:rPr>
+        <w:t>]</w:t>
+      </w:r>
+    </w:p>
+    <w:p>
+      <w:pPr>
+        <w:rPr>
+          <w:sz w:val="12"/>
+          <w:szCs w:val="12"/>
+          <w:lang w:val="en-US"/>
+        </w:rPr>
+      </w:pPr>
+      <w:proofErr w:type="spellStart"/>
+      <w:r>
+        <w:rPr>
+          <w:sz w:val="12"/>
+          <w:szCs w:val="12"/>
+          <w:lang w:val="en-US"/>
+        </w:rPr>
+        <w:t>line_json</w:t>
+      </w:r>
+      <w:proofErr w:type="spellEnd"/>
+      <w:r>
+        <w:rPr>
+          <w:sz w:val="12"/>
+          <w:szCs w:val="12"/>
+          <w:lang w:val="en-US"/>
+        </w:rPr>
+        <w:t xml:space="preserve"> = [</w:t>
+      </w:r>
+      <w:r>
+        <w:rPr>
           <w:color w:val="EE0000"/>
           <w:sz w:val="12"/>
           <w:szCs w:val="12"/>
@@ -1429,27 +1240,431 @@
           <w:szCs w:val="12"/>
           <w:lang w:val="en-US"/>
         </w:rPr>
+        <w:t>, 0.0, 0.0, 0.0, 0.0, 0.0, 0.0, 0.0, 0.0, 0.0]</w:t>
+      </w:r>
+    </w:p>
+    <w:p>
+      <w:pPr>
+        <w:rPr>
+          <w:color w:val="45B0E1" w:themeColor="accent1" w:themeTint="99"/>
+          <w:sz w:val="12"/>
+          <w:szCs w:val="12"/>
+        </w:rPr>
+      </w:pPr>
+      <w:proofErr w:type="spellStart"/>
+      <w:r>
+        <w:rPr>
+          <w:color w:val="45B0E1" w:themeColor="accent1" w:themeTint="99"/>
+          <w:sz w:val="12"/>
+          <w:szCs w:val="12"/>
+        </w:rPr>
+        <w:t>line_tokenized_txt</w:t>
+      </w:r>
+      <w:proofErr w:type="spellEnd"/>
+      <w:r>
+        <w:rPr>
+          <w:color w:val="45B0E1" w:themeColor="accent1" w:themeTint="99"/>
+          <w:sz w:val="12"/>
+          <w:szCs w:val="12"/>
+        </w:rPr>
+        <w:t xml:space="preserve"> = [0.0, 0.0, 0.0, 0.0, 0.0, 0.0, 0.0, 0.0, 0.0, 0.0]</w:t>
+      </w:r>
+      <w:r>
+        <w:rPr>
+          <w:color w:val="45B0E1" w:themeColor="accent1" w:themeTint="99"/>
+          <w:sz w:val="12"/>
+          <w:szCs w:val="12"/>
+        </w:rPr>
+        <w:br/>
+      </w:r>
+      <w:r>
+        <w:rPr>
+          <w:color w:val="EE0000"/>
+          <w:sz w:val="12"/>
+          <w:szCs w:val="12"/>
+        </w:rPr>
+        <w:t xml:space="preserve">Run 9: geeft een uitleg. Hieruit lijkt het dat hij wel de </w:t>
+      </w:r>
+      <w:proofErr w:type="spellStart"/>
+      <w:r>
+        <w:rPr>
+          <w:color w:val="EE0000"/>
+          <w:sz w:val="12"/>
+          <w:szCs w:val="12"/>
+        </w:rPr>
+        <w:t>layout</w:t>
+      </w:r>
+      <w:proofErr w:type="spellEnd"/>
+      <w:r>
+        <w:rPr>
+          <w:color w:val="EE0000"/>
+          <w:sz w:val="12"/>
+          <w:szCs w:val="12"/>
+        </w:rPr>
+        <w:t xml:space="preserve"> goed snapt, maar de instructievorm en output format niet. Er is een drang om </w:t>
+      </w:r>
+      <w:proofErr w:type="spellStart"/>
+      <w:r>
+        <w:rPr>
+          <w:color w:val="EE0000"/>
+          <w:sz w:val="12"/>
+          <w:szCs w:val="12"/>
+        </w:rPr>
+        <w:t>zsm</w:t>
+      </w:r>
+      <w:proofErr w:type="spellEnd"/>
+      <w:r>
+        <w:rPr>
+          <w:color w:val="EE0000"/>
+          <w:sz w:val="12"/>
+          <w:szCs w:val="12"/>
+        </w:rPr>
+        <w:t xml:space="preserve"> het doel te bereiken, en daarvoor niet van richting te wijken. Hij kan ook niet volgen dan ‘rechts’ of ‘links’ </w:t>
+      </w:r>
+      <w:proofErr w:type="spellStart"/>
+      <w:r>
+        <w:rPr>
+          <w:color w:val="EE0000"/>
+          <w:sz w:val="12"/>
+          <w:szCs w:val="12"/>
+        </w:rPr>
+        <w:t>incl</w:t>
+      </w:r>
+      <w:proofErr w:type="spellEnd"/>
+      <w:r>
+        <w:rPr>
+          <w:color w:val="EE0000"/>
+          <w:sz w:val="12"/>
+          <w:szCs w:val="12"/>
+        </w:rPr>
+        <w:t xml:space="preserve"> een stapje naar een volgend hokje is. </w:t>
+      </w:r>
+      <w:r>
+        <w:rPr>
+          <w:color w:val="EE0000"/>
+          <w:sz w:val="12"/>
+          <w:szCs w:val="12"/>
+        </w:rPr>
+        <w:t xml:space="preserve">Loopt door een muur heen waarvan hij weet dat deze er zit, zodat hij sneller bij het doel kan zijn. </w:t>
+      </w:r>
+    </w:p>
+    <w:p>
+      <w:pPr>
+        <w:rPr>
+          <w:sz w:val="12"/>
+          <w:szCs w:val="12"/>
+          <w:u w:val="single"/>
+        </w:rPr>
+      </w:pPr>
+      <w:proofErr w:type="spellStart"/>
+      <w:r>
+        <w:rPr>
+          <w:sz w:val="12"/>
+          <w:szCs w:val="12"/>
+        </w:rPr>
+        <w:t>occupancy_adj_json</w:t>
+      </w:r>
+      <w:proofErr w:type="spellEnd"/>
+      <w:r>
+        <w:rPr>
+          <w:sz w:val="12"/>
+          <w:szCs w:val="12"/>
+        </w:rPr>
+        <w:t xml:space="preserve"> = [0.0, 0.0, </w:t>
+      </w:r>
+      <w:r>
+        <w:rPr>
+          <w:color w:val="D86DCB" w:themeColor="accent5" w:themeTint="99"/>
+          <w:sz w:val="12"/>
+          <w:szCs w:val="12"/>
+        </w:rPr>
+        <w:t>12.5</w:t>
+      </w:r>
+      <w:r>
+        <w:rPr>
+          <w:sz w:val="12"/>
+          <w:szCs w:val="12"/>
+        </w:rPr>
         <w:t xml:space="preserve">, 0.0, </w:t>
       </w:r>
       <w:r>
         <w:rPr>
-          <w:color w:val="EE0000"/>
-          <w:sz w:val="12"/>
-          <w:szCs w:val="12"/>
-          <w:lang w:val="en-US"/>
-        </w:rPr>
-        <w:t>25.0</w:t>
-      </w:r>
-      <w:r>
-        <w:rPr>
-          <w:sz w:val="12"/>
-          <w:szCs w:val="12"/>
-          <w:lang w:val="en-US"/>
-        </w:rPr>
-        <w:t>, 0.0, 0.0, 0.0, 0.0, 0.0, 0.0, 0.0</w:t>
-      </w:r>
-      <w:r>
-        <w:rPr>
+          <w:color w:val="D86DCB" w:themeColor="accent5" w:themeTint="99"/>
+          <w:sz w:val="12"/>
+          <w:szCs w:val="12"/>
+        </w:rPr>
+        <w:t>8.333333333333332</w:t>
+      </w:r>
+      <w:r>
+        <w:rPr>
+          <w:sz w:val="12"/>
+          <w:szCs w:val="12"/>
+        </w:rPr>
+        <w:t xml:space="preserve">, 0.0, 0.0, 0.0, </w:t>
+      </w:r>
+      <w:r>
+        <w:rPr>
+          <w:color w:val="D86DCB" w:themeColor="accent5" w:themeTint="99"/>
+          <w:sz w:val="12"/>
+          <w:szCs w:val="12"/>
+        </w:rPr>
+        <w:t>8.333333333333332</w:t>
+      </w:r>
+      <w:r>
+        <w:rPr>
+          <w:sz w:val="12"/>
+          <w:szCs w:val="12"/>
+        </w:rPr>
+        <w:t>, 0.0]</w:t>
+      </w:r>
+      <w:r>
+        <w:rPr>
+          <w:sz w:val="12"/>
+          <w:szCs w:val="12"/>
+        </w:rPr>
+        <w:t xml:space="preserve"> </w:t>
+      </w:r>
+      <w:r>
+        <w:rPr>
+          <w:sz w:val="12"/>
+          <w:szCs w:val="12"/>
+        </w:rPr>
+        <w:br/>
+      </w:r>
+      <w:r>
+        <w:rPr>
+          <w:sz w:val="12"/>
+          <w:szCs w:val="12"/>
+          <w:u w:val="single"/>
+        </w:rPr>
+        <w:t>Run 3: 1</w:t>
+      </w:r>
+      <w:r>
+        <w:rPr>
+          <w:sz w:val="12"/>
+          <w:szCs w:val="12"/>
+          <w:u w:val="single"/>
+          <w:vertAlign w:val="superscript"/>
+        </w:rPr>
+        <w:t>e</w:t>
+      </w:r>
+      <w:r>
+        <w:rPr>
+          <w:sz w:val="12"/>
+          <w:szCs w:val="12"/>
+          <w:u w:val="single"/>
+        </w:rPr>
+        <w:t xml:space="preserve"> stap goed, loopt rechtsom een vierkantje (vierkant</w:t>
+      </w:r>
+      <w:r>
+        <w:rPr>
+          <w:sz w:val="12"/>
+          <w:szCs w:val="12"/>
+          <w:u w:val="single"/>
+        </w:rPr>
+        <w:t xml:space="preserve">je/spiraal </w:t>
+      </w:r>
+      <w:r>
+        <w:rPr>
+          <w:sz w:val="12"/>
+          <w:szCs w:val="12"/>
+          <w:u w:val="single"/>
+        </w:rPr>
+        <w:t>komt vaker voor bij NR ego vgm).</w:t>
+      </w:r>
+      <w:r>
+        <w:rPr>
+          <w:sz w:val="12"/>
+          <w:szCs w:val="12"/>
+          <w:u w:val="single"/>
+        </w:rPr>
+        <w:br/>
+        <w:t>Run 5</w:t>
+      </w:r>
+      <w:r>
+        <w:rPr>
+          <w:sz w:val="12"/>
+          <w:szCs w:val="12"/>
+          <w:u w:val="single"/>
+        </w:rPr>
+        <w:t>: 1</w:t>
+      </w:r>
+      <w:r>
+        <w:rPr>
+          <w:sz w:val="12"/>
+          <w:szCs w:val="12"/>
+          <w:u w:val="single"/>
+          <w:vertAlign w:val="superscript"/>
+        </w:rPr>
+        <w:t>e</w:t>
+      </w:r>
+      <w:r>
+        <w:rPr>
+          <w:sz w:val="12"/>
+          <w:szCs w:val="12"/>
+          <w:u w:val="single"/>
+        </w:rPr>
+        <w:t xml:space="preserve"> stap goed, loopt rechtsom een </w:t>
+      </w:r>
+      <w:r>
+        <w:rPr>
+          <w:sz w:val="12"/>
+          <w:szCs w:val="12"/>
+          <w:u w:val="single"/>
+        </w:rPr>
+        <w:t>spiraal</w:t>
+      </w:r>
+      <w:r>
+        <w:rPr>
+          <w:sz w:val="12"/>
+          <w:szCs w:val="12"/>
+          <w:u w:val="single"/>
+        </w:rPr>
+        <w:t xml:space="preserve"> (vierkant</w:t>
+      </w:r>
+      <w:r>
+        <w:rPr>
+          <w:sz w:val="12"/>
+          <w:szCs w:val="12"/>
+          <w:u w:val="single"/>
+        </w:rPr>
+        <w:t xml:space="preserve">je/spiraal </w:t>
+      </w:r>
+      <w:r>
+        <w:rPr>
+          <w:sz w:val="12"/>
+          <w:szCs w:val="12"/>
+          <w:u w:val="single"/>
+        </w:rPr>
+        <w:t>komt vaker voor bij NR ego vgm).</w:t>
+      </w:r>
+      <w:r>
+        <w:rPr>
+          <w:sz w:val="12"/>
+          <w:szCs w:val="12"/>
+          <w:u w:val="single"/>
+        </w:rPr>
+        <w:br/>
+      </w:r>
+      <w:r>
+        <w:rPr>
+          <w:sz w:val="12"/>
+          <w:szCs w:val="12"/>
+          <w:u w:val="single"/>
+        </w:rPr>
+        <w:t xml:space="preserve">Run 9:  </w:t>
+      </w:r>
+      <w:r>
+        <w:rPr>
+          <w:sz w:val="12"/>
+          <w:szCs w:val="12"/>
+          <w:u w:val="single"/>
+        </w:rPr>
+        <w:t>1</w:t>
+      </w:r>
+      <w:r>
+        <w:rPr>
+          <w:sz w:val="12"/>
+          <w:szCs w:val="12"/>
+          <w:u w:val="single"/>
+          <w:vertAlign w:val="superscript"/>
+        </w:rPr>
+        <w:t>e</w:t>
+      </w:r>
+      <w:r>
+        <w:rPr>
+          <w:sz w:val="12"/>
+          <w:szCs w:val="12"/>
+          <w:u w:val="single"/>
+        </w:rPr>
+        <w:t xml:space="preserve"> stap goed, loopt in een rare krin</w:t>
+      </w:r>
+      <w:r>
+        <w:rPr>
+          <w:sz w:val="12"/>
+          <w:szCs w:val="12"/>
+          <w:u w:val="single"/>
+        </w:rPr>
+        <w:t xml:space="preserve">gel (die ik niet kan verklaren) direct het vierkant uit. </w:t>
+      </w:r>
+    </w:p>
+    <w:p>
+      <w:pPr>
+        <w:rPr>
+          <w:color w:val="45B0E1" w:themeColor="accent1" w:themeTint="99"/>
+          <w:sz w:val="12"/>
+          <w:szCs w:val="12"/>
+        </w:rPr>
+      </w:pPr>
+      <w:proofErr w:type="spellStart"/>
+      <w:r>
+        <w:rPr>
+          <w:color w:val="45B0E1" w:themeColor="accent1" w:themeTint="99"/>
+          <w:sz w:val="12"/>
+          <w:szCs w:val="12"/>
+        </w:rPr>
+        <w:t>occupancy_adj_txt</w:t>
+      </w:r>
+      <w:proofErr w:type="spellEnd"/>
+      <w:r>
+        <w:rPr>
+          <w:color w:val="45B0E1" w:themeColor="accent1" w:themeTint="99"/>
+          <w:sz w:val="12"/>
+          <w:szCs w:val="12"/>
+        </w:rPr>
+        <w:t xml:space="preserve"> = [0.0, 0.0, 0.0, 0.0, 0.0, 0.0, 0.0, 0.0, 0.0, 0.0]</w:t>
+      </w:r>
+    </w:p>
+    <w:p>
+      <w:pPr>
+        <w:rPr>
+          <w:color w:val="45B0E1" w:themeColor="accent1" w:themeTint="99"/>
+          <w:sz w:val="12"/>
+          <w:szCs w:val="12"/>
+          <w:lang w:val="en-US"/>
+        </w:rPr>
+      </w:pPr>
+      <w:proofErr w:type="spellStart"/>
+      <w:r>
+        <w:rPr>
+          <w:color w:val="45B0E1" w:themeColor="accent1" w:themeTint="99"/>
+          <w:sz w:val="12"/>
+          <w:szCs w:val="12"/>
+          <w:lang w:val="en-US"/>
+        </w:rPr>
+        <w:t>occupancy_ascii_txt</w:t>
+      </w:r>
+      <w:proofErr w:type="spellEnd"/>
+      <w:r>
+        <w:rPr>
+          <w:color w:val="45B0E1" w:themeColor="accent1" w:themeTint="99"/>
+          <w:sz w:val="12"/>
+          <w:szCs w:val="12"/>
+          <w:lang w:val="en-US"/>
+        </w:rPr>
+        <w:t xml:space="preserve"> = </w:t>
+      </w:r>
+      <w:r>
+        <w:rPr>
+          <w:color w:val="45B0E1" w:themeColor="accent1" w:themeTint="99"/>
+          <w:sz w:val="12"/>
+          <w:szCs w:val="12"/>
+          <w:lang w:val="en-US"/>
+        </w:rPr>
+        <w:t>[</w:t>
+      </w:r>
+      <w:r>
+        <w:rPr>
+          <w:color w:val="45B0E1" w:themeColor="accent1" w:themeTint="99"/>
+          <w:sz w:val="12"/>
+          <w:szCs w:val="12"/>
+          <w:lang w:val="en-US"/>
+        </w:rPr>
+        <w:t>0.0, 0.0, 0.0, 0.0, 0.0, 0.0, 0.0, 0.0, 0.0, 0.0</w:t>
+      </w:r>
+      <w:r>
+        <w:rPr>
+          <w:color w:val="45B0E1" w:themeColor="accent1" w:themeTint="99"/>
           <w:sz w:val="12"/>
           <w:szCs w:val="12"/>
           <w:lang w:val="en-US"/>
@@ -1460,402 +1675,6 @@
     <w:p>
       <w:pPr>
         <w:rPr>
-          <w:color w:val="45B0E1" w:themeColor="accent1" w:themeTint="99"/>
-          <w:sz w:val="12"/>
-          <w:szCs w:val="12"/>
-          <w:lang w:val="en-US"/>
-        </w:rPr>
-      </w:pPr>
-      <w:proofErr w:type="spellStart"/>
-      <w:r>
-        <w:rPr>
-          <w:color w:val="45B0E1" w:themeColor="accent1" w:themeTint="99"/>
-          <w:sz w:val="12"/>
-          <w:szCs w:val="12"/>
-          <w:lang w:val="en-US"/>
-        </w:rPr>
-        <w:t>line_adj_txt</w:t>
-      </w:r>
-      <w:proofErr w:type="spellEnd"/>
-      <w:r>
-        <w:rPr>
-          <w:color w:val="45B0E1" w:themeColor="accent1" w:themeTint="99"/>
-          <w:sz w:val="12"/>
-          <w:szCs w:val="12"/>
-          <w:lang w:val="en-US"/>
-        </w:rPr>
-        <w:t xml:space="preserve"> = </w:t>
-      </w:r>
-      <w:r>
-        <w:rPr>
-          <w:color w:val="45B0E1" w:themeColor="accent1" w:themeTint="99"/>
-          <w:sz w:val="12"/>
-          <w:szCs w:val="12"/>
-          <w:lang w:val="en-US"/>
-        </w:rPr>
-        <w:t>[</w:t>
-      </w:r>
-      <w:r>
-        <w:rPr>
-          <w:color w:val="45B0E1" w:themeColor="accent1" w:themeTint="99"/>
-          <w:sz w:val="12"/>
-          <w:szCs w:val="12"/>
-          <w:lang w:val="en-US"/>
-        </w:rPr>
-        <w:t>0.0, 0.0, 0.0, 0.0, 0.0, 0.0, 0.0, 0.0, 0.0, 0.0</w:t>
-      </w:r>
-      <w:r>
-        <w:rPr>
-          <w:color w:val="45B0E1" w:themeColor="accent1" w:themeTint="99"/>
-          <w:sz w:val="12"/>
-          <w:szCs w:val="12"/>
-          <w:lang w:val="en-US"/>
-        </w:rPr>
-        <w:t>]</w:t>
-      </w:r>
-    </w:p>
-    <w:p>
-      <w:pPr>
-        <w:rPr>
-          <w:color w:val="45B0E1" w:themeColor="accent1" w:themeTint="99"/>
-          <w:sz w:val="12"/>
-          <w:szCs w:val="12"/>
-          <w:lang w:val="en-US"/>
-        </w:rPr>
-      </w:pPr>
-      <w:proofErr w:type="spellStart"/>
-      <w:r>
-        <w:rPr>
-          <w:color w:val="45B0E1" w:themeColor="accent1" w:themeTint="99"/>
-          <w:sz w:val="12"/>
-          <w:szCs w:val="12"/>
-          <w:lang w:val="en-US"/>
-        </w:rPr>
-        <w:t>line_jpg</w:t>
-      </w:r>
-      <w:proofErr w:type="spellEnd"/>
-      <w:r>
-        <w:rPr>
-          <w:color w:val="45B0E1" w:themeColor="accent1" w:themeTint="99"/>
-          <w:sz w:val="12"/>
-          <w:szCs w:val="12"/>
-          <w:lang w:val="en-US"/>
-        </w:rPr>
-        <w:t xml:space="preserve"> = </w:t>
-      </w:r>
-      <w:r>
-        <w:rPr>
-          <w:color w:val="45B0E1" w:themeColor="accent1" w:themeTint="99"/>
-          <w:sz w:val="12"/>
-          <w:szCs w:val="12"/>
-          <w:lang w:val="en-US"/>
-        </w:rPr>
-        <w:t>[</w:t>
-      </w:r>
-      <w:r>
-        <w:rPr>
-          <w:color w:val="45B0E1" w:themeColor="accent1" w:themeTint="99"/>
-          <w:sz w:val="12"/>
-          <w:szCs w:val="12"/>
-          <w:lang w:val="en-US"/>
-        </w:rPr>
-        <w:t>0.0, 0.0, 0.0, 0.0, 0.0, 0.0, 0.0, 0.0, 0.0, 0.0</w:t>
-      </w:r>
-      <w:r>
-        <w:rPr>
-          <w:color w:val="45B0E1" w:themeColor="accent1" w:themeTint="99"/>
-          <w:sz w:val="12"/>
-          <w:szCs w:val="12"/>
-          <w:lang w:val="en-US"/>
-        </w:rPr>
-        <w:t>]</w:t>
-      </w:r>
-    </w:p>
-    <w:p>
-      <w:pPr>
-        <w:rPr>
-          <w:sz w:val="12"/>
-          <w:szCs w:val="12"/>
-          <w:lang w:val="en-US"/>
-        </w:rPr>
-      </w:pPr>
-      <w:proofErr w:type="spellStart"/>
-      <w:r>
-        <w:rPr>
-          <w:sz w:val="12"/>
-          <w:szCs w:val="12"/>
-          <w:lang w:val="en-US"/>
-        </w:rPr>
-        <w:t>line_json</w:t>
-      </w:r>
-      <w:proofErr w:type="spellEnd"/>
-      <w:r>
-        <w:rPr>
-          <w:sz w:val="12"/>
-          <w:szCs w:val="12"/>
-          <w:lang w:val="en-US"/>
-        </w:rPr>
-        <w:t xml:space="preserve"> = </w:t>
-      </w:r>
-      <w:r>
-        <w:rPr>
-          <w:sz w:val="12"/>
-          <w:szCs w:val="12"/>
-          <w:lang w:val="en-US"/>
-        </w:rPr>
-        <w:t>[</w:t>
-      </w:r>
-      <w:r>
-        <w:rPr>
-          <w:color w:val="EE0000"/>
-          <w:sz w:val="12"/>
-          <w:szCs w:val="12"/>
-          <w:lang w:val="en-US"/>
-        </w:rPr>
-        <w:t>25.0</w:t>
-      </w:r>
-      <w:r>
-        <w:rPr>
-          <w:sz w:val="12"/>
-          <w:szCs w:val="12"/>
-          <w:lang w:val="en-US"/>
-        </w:rPr>
-        <w:t>, 0.0, 0.0, 0.0, 0.0, 0.0, 0.0, 0.0, 0.0, 0.0</w:t>
-      </w:r>
-      <w:r>
-        <w:rPr>
-          <w:sz w:val="12"/>
-          <w:szCs w:val="12"/>
-          <w:lang w:val="en-US"/>
-        </w:rPr>
-        <w:t>]</w:t>
-      </w:r>
-    </w:p>
-    <w:p>
-      <w:pPr>
-        <w:rPr>
-          <w:color w:val="45B0E1" w:themeColor="accent1" w:themeTint="99"/>
-          <w:sz w:val="12"/>
-          <w:szCs w:val="12"/>
-          <w:lang w:val="en-US"/>
-        </w:rPr>
-      </w:pPr>
-      <w:proofErr w:type="spellStart"/>
-      <w:r>
-        <w:rPr>
-          <w:color w:val="45B0E1" w:themeColor="accent1" w:themeTint="99"/>
-          <w:sz w:val="12"/>
-          <w:szCs w:val="12"/>
-          <w:lang w:val="en-US"/>
-        </w:rPr>
-        <w:t>line_tokenized_txt</w:t>
-      </w:r>
-      <w:proofErr w:type="spellEnd"/>
-      <w:r>
-        <w:rPr>
-          <w:color w:val="45B0E1" w:themeColor="accent1" w:themeTint="99"/>
-          <w:sz w:val="12"/>
-          <w:szCs w:val="12"/>
-          <w:lang w:val="en-US"/>
-        </w:rPr>
-        <w:t xml:space="preserve"> = </w:t>
-      </w:r>
-      <w:r>
-        <w:rPr>
-          <w:color w:val="45B0E1" w:themeColor="accent1" w:themeTint="99"/>
-          <w:sz w:val="12"/>
-          <w:szCs w:val="12"/>
-          <w:lang w:val="en-US"/>
-        </w:rPr>
-        <w:t>[</w:t>
-      </w:r>
-      <w:r>
-        <w:rPr>
-          <w:color w:val="45B0E1" w:themeColor="accent1" w:themeTint="99"/>
-          <w:sz w:val="12"/>
-          <w:szCs w:val="12"/>
-          <w:lang w:val="en-US"/>
-        </w:rPr>
-        <w:t>0.0, 0.0, 0.0, 0.0, 0.0, 0.0, 0.0, 0.0, 0.0, 0.0</w:t>
-      </w:r>
-      <w:r>
-        <w:rPr>
-          <w:color w:val="45B0E1" w:themeColor="accent1" w:themeTint="99"/>
-          <w:sz w:val="12"/>
-          <w:szCs w:val="12"/>
-          <w:lang w:val="en-US"/>
-        </w:rPr>
-        <w:t>]</w:t>
-      </w:r>
-    </w:p>
-    <w:p>
-      <w:pPr>
-        <w:rPr>
-          <w:sz w:val="12"/>
-          <w:szCs w:val="12"/>
-          <w:lang w:val="en-US"/>
-        </w:rPr>
-      </w:pPr>
-      <w:proofErr w:type="spellStart"/>
-      <w:r>
-        <w:rPr>
-          <w:sz w:val="12"/>
-          <w:szCs w:val="12"/>
-          <w:lang w:val="en-US"/>
-        </w:rPr>
-        <w:t>occupancy_adj_json</w:t>
-      </w:r>
-      <w:proofErr w:type="spellEnd"/>
-      <w:r>
-        <w:rPr>
-          <w:sz w:val="12"/>
-          <w:szCs w:val="12"/>
-          <w:lang w:val="en-US"/>
-        </w:rPr>
-        <w:t xml:space="preserve"> = </w:t>
-      </w:r>
-      <w:r>
-        <w:rPr>
-          <w:sz w:val="12"/>
-          <w:szCs w:val="12"/>
-          <w:lang w:val="en-US"/>
-        </w:rPr>
-        <w:t>[</w:t>
-      </w:r>
-      <w:r>
-        <w:rPr>
-          <w:sz w:val="12"/>
-          <w:szCs w:val="12"/>
-          <w:lang w:val="en-US"/>
-        </w:rPr>
-        <w:t>0.0, 0.0, 12.5, 0.0, 8.333333333333332, 0.0, 0.0, 0.0, 8.333333333333332, 0.0</w:t>
-      </w:r>
-      <w:r>
-        <w:rPr>
-          <w:sz w:val="12"/>
-          <w:szCs w:val="12"/>
-          <w:lang w:val="en-US"/>
-        </w:rPr>
-        <w:t>]</w:t>
-      </w:r>
-    </w:p>
-    <w:p>
-      <w:pPr>
-        <w:rPr>
-          <w:color w:val="45B0E1" w:themeColor="accent1" w:themeTint="99"/>
-          <w:sz w:val="12"/>
-          <w:szCs w:val="12"/>
-          <w:lang w:val="en-US"/>
-        </w:rPr>
-      </w:pPr>
-      <w:proofErr w:type="spellStart"/>
-      <w:r>
-        <w:rPr>
-          <w:color w:val="45B0E1" w:themeColor="accent1" w:themeTint="99"/>
-          <w:sz w:val="12"/>
-          <w:szCs w:val="12"/>
-          <w:lang w:val="en-US"/>
-        </w:rPr>
-        <w:t>occupancy_adj_txt</w:t>
-      </w:r>
-      <w:proofErr w:type="spellEnd"/>
-      <w:r>
-        <w:rPr>
-          <w:color w:val="45B0E1" w:themeColor="accent1" w:themeTint="99"/>
-          <w:sz w:val="12"/>
-          <w:szCs w:val="12"/>
-          <w:lang w:val="en-US"/>
-        </w:rPr>
-        <w:t xml:space="preserve"> = </w:t>
-      </w:r>
-      <w:r>
-        <w:rPr>
-          <w:color w:val="45B0E1" w:themeColor="accent1" w:themeTint="99"/>
-          <w:sz w:val="12"/>
-          <w:szCs w:val="12"/>
-          <w:lang w:val="en-US"/>
-        </w:rPr>
-        <w:t>[</w:t>
-      </w:r>
-      <w:r>
-        <w:rPr>
-          <w:color w:val="45B0E1" w:themeColor="accent1" w:themeTint="99"/>
-          <w:sz w:val="12"/>
-          <w:szCs w:val="12"/>
-          <w:lang w:val="en-US"/>
-        </w:rPr>
-        <w:t>0.0, 0.0, 0.0, 0.0, 0.0, 0.0, 0.0, 0.0, 0.0, 0.0</w:t>
-      </w:r>
-      <w:r>
-        <w:rPr>
-          <w:color w:val="45B0E1" w:themeColor="accent1" w:themeTint="99"/>
-          <w:sz w:val="12"/>
-          <w:szCs w:val="12"/>
-          <w:lang w:val="en-US"/>
-        </w:rPr>
-        <w:t>]</w:t>
-      </w:r>
-    </w:p>
-    <w:p>
-      <w:pPr>
-        <w:rPr>
-          <w:color w:val="45B0E1" w:themeColor="accent1" w:themeTint="99"/>
-          <w:sz w:val="12"/>
-          <w:szCs w:val="12"/>
-          <w:lang w:val="en-US"/>
-        </w:rPr>
-      </w:pPr>
-      <w:proofErr w:type="spellStart"/>
-      <w:r>
-        <w:rPr>
-          <w:color w:val="45B0E1" w:themeColor="accent1" w:themeTint="99"/>
-          <w:sz w:val="12"/>
-          <w:szCs w:val="12"/>
-          <w:lang w:val="en-US"/>
-        </w:rPr>
-        <w:t>occupancy_ascii_txt</w:t>
-      </w:r>
-      <w:proofErr w:type="spellEnd"/>
-      <w:r>
-        <w:rPr>
-          <w:color w:val="45B0E1" w:themeColor="accent1" w:themeTint="99"/>
-          <w:sz w:val="12"/>
-          <w:szCs w:val="12"/>
-          <w:lang w:val="en-US"/>
-        </w:rPr>
-        <w:t xml:space="preserve"> = </w:t>
-      </w:r>
-      <w:r>
-        <w:rPr>
-          <w:color w:val="45B0E1" w:themeColor="accent1" w:themeTint="99"/>
-          <w:sz w:val="12"/>
-          <w:szCs w:val="12"/>
-          <w:lang w:val="en-US"/>
-        </w:rPr>
-        <w:t>[</w:t>
-      </w:r>
-      <w:r>
-        <w:rPr>
-          <w:color w:val="45B0E1" w:themeColor="accent1" w:themeTint="99"/>
-          <w:sz w:val="12"/>
-          <w:szCs w:val="12"/>
-          <w:lang w:val="en-US"/>
-        </w:rPr>
-        <w:t>0.0, 0.0, 0.0, 0.0, 0.0, 0.0, 0.0, 0.0, 0.0, 0.0</w:t>
-      </w:r>
-      <w:r>
-        <w:rPr>
-          <w:color w:val="45B0E1" w:themeColor="accent1" w:themeTint="99"/>
-          <w:sz w:val="12"/>
-          <w:szCs w:val="12"/>
-          <w:lang w:val="en-US"/>
-        </w:rPr>
-        <w:t>]</w:t>
-      </w:r>
-    </w:p>
-    <w:p>
-      <w:pPr>
-        <w:rPr>
           <w:sz w:val="12"/>
           <w:szCs w:val="12"/>
           <w:lang w:val="en-US"/>
@@ -1877,23 +1696,7 @@
           <w:szCs w:val="12"/>
           <w:lang w:val="en-US"/>
         </w:rPr>
-        <w:t xml:space="preserve"> = </w:t>
-      </w:r>
-      <w:r>
-        <w:rPr>
-          <w:sz w:val="12"/>
-          <w:szCs w:val="12"/>
-          <w:lang w:val="en-US"/>
-        </w:rPr>
-        <w:t>[</w:t>
-      </w:r>
-      <w:r>
-        <w:rPr>
-          <w:sz w:val="12"/>
-          <w:szCs w:val="12"/>
-          <w:lang w:val="en-US"/>
-        </w:rPr>
-        <w:t xml:space="preserve">0.0, 0.0, </w:t>
+        <w:t xml:space="preserve"> = [0.0, 0.0, </w:t>
       </w:r>
       <w:r>
         <w:rPr>
@@ -1910,34 +1713,27 @@
           <w:szCs w:val="12"/>
           <w:lang w:val="en-US"/>
         </w:rPr>
-        <w:t>, 0.0, 0.0, 0.0, 0.0, 0.0, 0.0, 0.0</w:t>
-      </w:r>
-      <w:r>
-        <w:rPr>
-          <w:sz w:val="12"/>
-          <w:szCs w:val="12"/>
-          <w:lang w:val="en-US"/>
-        </w:rPr>
-        <w:t>]</w:t>
-      </w:r>
-    </w:p>
-    <w:p>
-      <w:pPr>
-        <w:rPr>
-          <w:color w:val="45B0E1" w:themeColor="accent1" w:themeTint="99"/>
-          <w:sz w:val="12"/>
-          <w:szCs w:val="12"/>
-          <w:lang w:val="en-US"/>
-        </w:rPr>
-      </w:pPr>
-      <w:proofErr w:type="spellStart"/>
-      <w:r>
-        <w:rPr>
-          <w:color w:val="45B0E1" w:themeColor="accent1" w:themeTint="99"/>
-          <w:sz w:val="12"/>
-          <w:szCs w:val="12"/>
-          <w:lang w:val="en-US"/>
-        </w:rPr>
+        <w:t>, 0.0, 0.0, 0.0, 0.0, 0.0, 0.0, 0.0]</w:t>
+      </w:r>
+    </w:p>
+    <w:p>
+      <w:pPr>
+        <w:rPr>
+          <w:color w:val="45B0E1" w:themeColor="accent1" w:themeTint="99"/>
+          <w:sz w:val="12"/>
+          <w:szCs w:val="12"/>
+          <w:lang w:val="en-US"/>
+        </w:rPr>
+      </w:pPr>
+      <w:proofErr w:type="spellStart"/>
+      <w:r>
+        <w:rPr>
+          <w:color w:val="45B0E1" w:themeColor="accent1" w:themeTint="99"/>
+          <w:sz w:val="12"/>
+          <w:szCs w:val="12"/>
+          <w:lang w:val="en-US"/>
+        </w:rPr>
+        <w:lastRenderedPageBreak/>
         <w:t>occupancy_json</w:t>
       </w:r>
       <w:proofErr w:type="spellEnd"/>
@@ -2062,7 +1858,6 @@
           <w:szCs w:val="12"/>
           <w:lang w:val="en-US"/>
         </w:rPr>
-        <w:lastRenderedPageBreak/>
         <w:t>R - COORDS</w:t>
       </w:r>
     </w:p>
@@ -2129,16 +1924,14 @@
           <w:color w:val="45B0E1" w:themeColor="accent1" w:themeTint="99"/>
           <w:sz w:val="12"/>
           <w:szCs w:val="12"/>
-          <w:lang w:val="en-US"/>
-        </w:rPr>
-      </w:pPr>
-      <w:proofErr w:type="spellStart"/>
-      <w:r>
-        <w:rPr>
-          <w:color w:val="45B0E1" w:themeColor="accent1" w:themeTint="99"/>
-          <w:sz w:val="12"/>
-          <w:szCs w:val="12"/>
-          <w:lang w:val="en-US"/>
+        </w:rPr>
+      </w:pPr>
+      <w:proofErr w:type="spellStart"/>
+      <w:r>
+        <w:rPr>
+          <w:color w:val="45B0E1" w:themeColor="accent1" w:themeTint="99"/>
+          <w:sz w:val="12"/>
+          <w:szCs w:val="12"/>
         </w:rPr>
         <w:t>line_adj_txt</w:t>
       </w:r>
@@ -2148,21 +1941,155 @@
           <w:color w:val="45B0E1" w:themeColor="accent1" w:themeTint="99"/>
           <w:sz w:val="12"/>
           <w:szCs w:val="12"/>
-          <w:lang w:val="en-US"/>
+        </w:rPr>
+        <w:t xml:space="preserve"> = [100.0, 100.0, 100.0, 100.0, 100.0, 100.0, 100.0, 100.0, 100.0, 100.0]</w:t>
+      </w:r>
+    </w:p>
+    <w:p>
+      <w:pPr>
+        <w:rPr>
+          <w:color w:val="EE0000"/>
+          <w:sz w:val="12"/>
+          <w:szCs w:val="12"/>
+        </w:rPr>
+      </w:pPr>
+      <w:proofErr w:type="spellStart"/>
+      <w:r>
+        <w:rPr>
+          <w:sz w:val="12"/>
+          <w:szCs w:val="12"/>
+        </w:rPr>
+        <w:t>line_jpg</w:t>
+      </w:r>
+      <w:proofErr w:type="spellEnd"/>
+      <w:r>
+        <w:rPr>
+          <w:sz w:val="12"/>
+          <w:szCs w:val="12"/>
         </w:rPr>
         <w:t xml:space="preserve"> = </w:t>
       </w:r>
       <w:r>
         <w:rPr>
-          <w:color w:val="45B0E1" w:themeColor="accent1" w:themeTint="99"/>
-          <w:sz w:val="12"/>
-          <w:szCs w:val="12"/>
-          <w:lang w:val="en-US"/>
+          <w:sz w:val="12"/>
+          <w:szCs w:val="12"/>
         </w:rPr>
         <w:t>[</w:t>
       </w:r>
       <w:r>
         <w:rPr>
+          <w:sz w:val="12"/>
+          <w:szCs w:val="12"/>
+        </w:rPr>
+        <w:t xml:space="preserve">40.0, 100.0, 100.0, 100.0, </w:t>
+      </w:r>
+      <w:r>
+        <w:rPr>
+          <w:color w:val="EE0000"/>
+          <w:sz w:val="12"/>
+          <w:szCs w:val="12"/>
+        </w:rPr>
+        <w:t>28.57142857142857</w:t>
+      </w:r>
+      <w:r>
+        <w:rPr>
+          <w:sz w:val="12"/>
+          <w:szCs w:val="12"/>
+        </w:rPr>
+        <w:t>, 40.0, 40.0, 100.0, 100.0, 100.0</w:t>
+      </w:r>
+      <w:r>
+        <w:rPr>
+          <w:sz w:val="12"/>
+          <w:szCs w:val="12"/>
+        </w:rPr>
+        <w:t>]</w:t>
+      </w:r>
+      <w:r>
+        <w:rPr>
+          <w:sz w:val="12"/>
+          <w:szCs w:val="12"/>
+        </w:rPr>
+        <w:t xml:space="preserve"> </w:t>
+      </w:r>
+      <w:r>
+        <w:rPr>
+          <w:color w:val="EE0000"/>
+          <w:sz w:val="12"/>
+          <w:szCs w:val="12"/>
+        </w:rPr>
+        <w:t xml:space="preserve">Loopt vast na 2 stappen en begrijpt dan het doolhof niet meer. De eerste twee stappen zijn wel correct, maar dan begint hij muren te hallucineren. Voor het eindantwoord gebruikt hij niet deze twee eerste stappen omdat hij denkt dat ze doodlopen. </w:t>
+      </w:r>
+    </w:p>
+    <w:p>
+      <w:pPr>
+        <w:rPr>
+          <w:sz w:val="12"/>
+          <w:szCs w:val="12"/>
+          <w:lang w:val="en-US"/>
+        </w:rPr>
+      </w:pPr>
+      <w:proofErr w:type="spellStart"/>
+      <w:r>
+        <w:rPr>
+          <w:color w:val="45B0E1" w:themeColor="accent1" w:themeTint="99"/>
+          <w:sz w:val="12"/>
+          <w:szCs w:val="12"/>
+          <w:lang w:val="en-US"/>
+        </w:rPr>
+        <w:t>line_json</w:t>
+      </w:r>
+      <w:proofErr w:type="spellEnd"/>
+      <w:r>
+        <w:rPr>
+          <w:color w:val="45B0E1" w:themeColor="accent1" w:themeTint="99"/>
+          <w:sz w:val="12"/>
+          <w:szCs w:val="12"/>
+          <w:lang w:val="en-US"/>
+        </w:rPr>
+        <w:t xml:space="preserve"> = [100.0, 100.0, 100.0, 100.0, 100.0, 100.0, 100.0, 100.0, 100.0, 100.0]</w:t>
+      </w:r>
+    </w:p>
+    <w:p>
+      <w:pPr>
+        <w:rPr>
+          <w:color w:val="45B0E1" w:themeColor="accent1" w:themeTint="99"/>
+          <w:sz w:val="12"/>
+          <w:szCs w:val="12"/>
+          <w:lang w:val="en-US"/>
+        </w:rPr>
+      </w:pPr>
+      <w:proofErr w:type="spellStart"/>
+      <w:r>
+        <w:rPr>
+          <w:color w:val="45B0E1" w:themeColor="accent1" w:themeTint="99"/>
+          <w:sz w:val="12"/>
+          <w:szCs w:val="12"/>
+          <w:lang w:val="en-US"/>
+        </w:rPr>
+        <w:t>line_tokenized_txt</w:t>
+      </w:r>
+      <w:proofErr w:type="spellEnd"/>
+      <w:r>
+        <w:rPr>
+          <w:color w:val="45B0E1" w:themeColor="accent1" w:themeTint="99"/>
+          <w:sz w:val="12"/>
+          <w:szCs w:val="12"/>
+          <w:lang w:val="en-US"/>
+        </w:rPr>
+        <w:t xml:space="preserve"> = </w:t>
+      </w:r>
+      <w:r>
+        <w:rPr>
+          <w:color w:val="45B0E1" w:themeColor="accent1" w:themeTint="99"/>
+          <w:sz w:val="12"/>
+          <w:szCs w:val="12"/>
+          <w:lang w:val="en-US"/>
+        </w:rPr>
+        <w:t>[</w:t>
+      </w:r>
+      <w:r>
+        <w:rPr>
           <w:color w:val="45B0E1" w:themeColor="accent1" w:themeTint="99"/>
           <w:sz w:val="12"/>
           <w:szCs w:val="12"/>
@@ -2183,63 +2110,177 @@
     <w:p>
       <w:pPr>
         <w:rPr>
-          <w:color w:val="EE0000"/>
-          <w:sz w:val="12"/>
-          <w:szCs w:val="12"/>
-        </w:rPr>
-      </w:pPr>
-      <w:proofErr w:type="spellStart"/>
-      <w:r>
-        <w:rPr>
-          <w:sz w:val="12"/>
-          <w:szCs w:val="12"/>
-        </w:rPr>
-        <w:t>line_jpg</w:t>
-      </w:r>
-      <w:proofErr w:type="spellEnd"/>
-      <w:r>
-        <w:rPr>
-          <w:sz w:val="12"/>
-          <w:szCs w:val="12"/>
+          <w:color w:val="45B0E1" w:themeColor="accent1" w:themeTint="99"/>
+          <w:sz w:val="12"/>
+          <w:szCs w:val="12"/>
+          <w:lang w:val="en-US"/>
+        </w:rPr>
+      </w:pPr>
+      <w:proofErr w:type="spellStart"/>
+      <w:r>
+        <w:rPr>
+          <w:color w:val="45B0E1" w:themeColor="accent1" w:themeTint="99"/>
+          <w:sz w:val="12"/>
+          <w:szCs w:val="12"/>
+          <w:lang w:val="en-US"/>
+        </w:rPr>
+        <w:t>occupancy_adj_json</w:t>
+      </w:r>
+      <w:proofErr w:type="spellEnd"/>
+      <w:r>
+        <w:rPr>
+          <w:color w:val="45B0E1" w:themeColor="accent1" w:themeTint="99"/>
+          <w:sz w:val="12"/>
+          <w:szCs w:val="12"/>
+          <w:lang w:val="en-US"/>
         </w:rPr>
         <w:t xml:space="preserve"> = </w:t>
       </w:r>
       <w:r>
         <w:rPr>
-          <w:sz w:val="12"/>
-          <w:szCs w:val="12"/>
+          <w:color w:val="45B0E1" w:themeColor="accent1" w:themeTint="99"/>
+          <w:sz w:val="12"/>
+          <w:szCs w:val="12"/>
+          <w:lang w:val="en-US"/>
         </w:rPr>
         <w:t>[</w:t>
       </w:r>
       <w:r>
         <w:rPr>
-          <w:sz w:val="12"/>
-          <w:szCs w:val="12"/>
-        </w:rPr>
-        <w:t xml:space="preserve">40.0, 100.0, 100.0, 100.0, </w:t>
-      </w:r>
-      <w:r>
-        <w:rPr>
-          <w:color w:val="EE0000"/>
-          <w:sz w:val="12"/>
-          <w:szCs w:val="12"/>
-        </w:rPr>
-        <w:t>28.57142857142857</w:t>
-      </w:r>
-      <w:r>
-        <w:rPr>
-          <w:sz w:val="12"/>
-          <w:szCs w:val="12"/>
-        </w:rPr>
-        <w:t>, 40.0, 40.0, 100.0, 100.0, 100.0</w:t>
-      </w:r>
-      <w:r>
-        <w:rPr>
-          <w:sz w:val="12"/>
-          <w:szCs w:val="12"/>
+          <w:color w:val="45B0E1" w:themeColor="accent1" w:themeTint="99"/>
+          <w:sz w:val="12"/>
+          <w:szCs w:val="12"/>
+          <w:lang w:val="en-US"/>
+        </w:rPr>
+        <w:t>100.0, 100.0, 100.0, 100.0, 100.0, 100.0, 100.0, 100.0, 100.0, 100.0</w:t>
+      </w:r>
+      <w:r>
+        <w:rPr>
+          <w:color w:val="45B0E1" w:themeColor="accent1" w:themeTint="99"/>
+          <w:sz w:val="12"/>
+          <w:szCs w:val="12"/>
+          <w:lang w:val="en-US"/>
         </w:rPr>
         <w:t>]</w:t>
       </w:r>
+    </w:p>
+    <w:p>
+      <w:pPr>
+        <w:rPr>
+          <w:color w:val="45B0E1" w:themeColor="accent1" w:themeTint="99"/>
+          <w:sz w:val="12"/>
+          <w:szCs w:val="12"/>
+          <w:lang w:val="en-US"/>
+        </w:rPr>
+      </w:pPr>
+      <w:proofErr w:type="spellStart"/>
+      <w:r>
+        <w:rPr>
+          <w:color w:val="45B0E1" w:themeColor="accent1" w:themeTint="99"/>
+          <w:sz w:val="12"/>
+          <w:szCs w:val="12"/>
+          <w:lang w:val="en-US"/>
+        </w:rPr>
+        <w:t>occupancy_adj_txt</w:t>
+      </w:r>
+      <w:proofErr w:type="spellEnd"/>
+      <w:r>
+        <w:rPr>
+          <w:color w:val="45B0E1" w:themeColor="accent1" w:themeTint="99"/>
+          <w:sz w:val="12"/>
+          <w:szCs w:val="12"/>
+          <w:lang w:val="en-US"/>
+        </w:rPr>
+        <w:t xml:space="preserve"> = </w:t>
+      </w:r>
+      <w:r>
+        <w:rPr>
+          <w:color w:val="45B0E1" w:themeColor="accent1" w:themeTint="99"/>
+          <w:sz w:val="12"/>
+          <w:szCs w:val="12"/>
+          <w:lang w:val="en-US"/>
+        </w:rPr>
+        <w:t>[</w:t>
+      </w:r>
+      <w:r>
+        <w:rPr>
+          <w:color w:val="45B0E1" w:themeColor="accent1" w:themeTint="99"/>
+          <w:sz w:val="12"/>
+          <w:szCs w:val="12"/>
+          <w:lang w:val="en-US"/>
+        </w:rPr>
+        <w:t>100.0, 100.0, 100.0, 100.0, 100.0, 100.0, 100.0, 100.0, 100.0, 100.0</w:t>
+      </w:r>
+      <w:r>
+        <w:rPr>
+          <w:color w:val="45B0E1" w:themeColor="accent1" w:themeTint="99"/>
+          <w:sz w:val="12"/>
+          <w:szCs w:val="12"/>
+          <w:lang w:val="en-US"/>
+        </w:rPr>
+        <w:t>]</w:t>
+      </w:r>
+    </w:p>
+    <w:p>
+      <w:pPr>
+        <w:rPr>
+          <w:sz w:val="12"/>
+          <w:szCs w:val="12"/>
+        </w:rPr>
+      </w:pPr>
+      <w:proofErr w:type="spellStart"/>
+      <w:r>
+        <w:rPr>
+          <w:sz w:val="12"/>
+          <w:szCs w:val="12"/>
+        </w:rPr>
+        <w:t>occupancy_ascii_txt</w:t>
+      </w:r>
+      <w:proofErr w:type="spellEnd"/>
+      <w:r>
+        <w:rPr>
+          <w:sz w:val="12"/>
+          <w:szCs w:val="12"/>
+        </w:rPr>
+        <w:t xml:space="preserve"> = </w:t>
+      </w:r>
+      <w:r>
+        <w:rPr>
+          <w:sz w:val="12"/>
+          <w:szCs w:val="12"/>
+        </w:rPr>
+        <w:t>[</w:t>
+      </w:r>
+      <w:r>
+        <w:rPr>
+          <w:color w:val="EE0000"/>
+          <w:sz w:val="12"/>
+          <w:szCs w:val="12"/>
+        </w:rPr>
+        <w:t xml:space="preserve">22.22222222222222, </w:t>
+      </w:r>
+      <w:r>
+        <w:rPr>
+          <w:sz w:val="12"/>
+          <w:szCs w:val="12"/>
+        </w:rPr>
+        <w:t xml:space="preserve">100.0, 100.0, 100.0, 100.0, 100.0, 100.0, 100.0, </w:t>
+      </w:r>
+      <w:r>
+        <w:rPr>
+          <w:color w:val="EE0000"/>
+          <w:sz w:val="12"/>
+          <w:szCs w:val="12"/>
+        </w:rPr>
+        <w:t>46.15384615384615, 77.77777777777779</w:t>
+      </w:r>
+      <w:r>
+        <w:rPr>
+          <w:sz w:val="12"/>
+          <w:szCs w:val="12"/>
+        </w:rPr>
+        <w:t>]</w:t>
+      </w:r>
       <w:r>
         <w:rPr>
           <w:sz w:val="12"/>
@@ -2249,303 +2290,6 @@
       </w:r>
       <w:r>
         <w:rPr>
-          <w:color w:val="EE0000"/>
-          <w:sz w:val="12"/>
-          <w:szCs w:val="12"/>
-        </w:rPr>
-        <w:t xml:space="preserve">Loopt vast na 2 stappen en begrijpt dan het doolhof niet meer. De eerste twee stappen zijn wel correct, maar dan begint hij muren te hallucineren. Voor het eindantwoord gebruikt hij niet deze twee eerste stappen omdat hij denkt dat ze doodlopen. </w:t>
-      </w:r>
-    </w:p>
-    <w:p>
-      <w:pPr>
-        <w:rPr>
-          <w:sz w:val="12"/>
-          <w:szCs w:val="12"/>
-        </w:rPr>
-      </w:pPr>
-      <w:proofErr w:type="spellStart"/>
-      <w:r>
-        <w:rPr>
-          <w:color w:val="45B0E1" w:themeColor="accent1" w:themeTint="99"/>
-          <w:sz w:val="12"/>
-          <w:szCs w:val="12"/>
-        </w:rPr>
-        <w:t>line_json</w:t>
-      </w:r>
-      <w:proofErr w:type="spellEnd"/>
-      <w:r>
-        <w:rPr>
-          <w:color w:val="45B0E1" w:themeColor="accent1" w:themeTint="99"/>
-          <w:sz w:val="12"/>
-          <w:szCs w:val="12"/>
-        </w:rPr>
-        <w:t xml:space="preserve"> = </w:t>
-      </w:r>
-      <w:r>
-        <w:rPr>
-          <w:color w:val="45B0E1" w:themeColor="accent1" w:themeTint="99"/>
-          <w:sz w:val="12"/>
-          <w:szCs w:val="12"/>
-        </w:rPr>
-        <w:t>[</w:t>
-      </w:r>
-      <w:r>
-        <w:rPr>
-          <w:color w:val="45B0E1" w:themeColor="accent1" w:themeTint="99"/>
-          <w:sz w:val="12"/>
-          <w:szCs w:val="12"/>
-        </w:rPr>
-        <w:t>100.0, 100.0, 100.0, 100.0, 100.0, 100.0, 100.0, 100.0, 100.0, 100.0</w:t>
-      </w:r>
-      <w:r>
-        <w:rPr>
-          <w:color w:val="45B0E1" w:themeColor="accent1" w:themeTint="99"/>
-          <w:sz w:val="12"/>
-          <w:szCs w:val="12"/>
-        </w:rPr>
-        <w:t>]</w:t>
-      </w:r>
-    </w:p>
-    <w:p>
-      <w:pPr>
-        <w:rPr>
-          <w:color w:val="45B0E1" w:themeColor="accent1" w:themeTint="99"/>
-          <w:sz w:val="12"/>
-          <w:szCs w:val="12"/>
-          <w:lang w:val="en-US"/>
-        </w:rPr>
-      </w:pPr>
-      <w:proofErr w:type="spellStart"/>
-      <w:r>
-        <w:rPr>
-          <w:color w:val="45B0E1" w:themeColor="accent1" w:themeTint="99"/>
-          <w:sz w:val="12"/>
-          <w:szCs w:val="12"/>
-          <w:lang w:val="en-US"/>
-        </w:rPr>
-        <w:t>line_tokenized_txt</w:t>
-      </w:r>
-      <w:proofErr w:type="spellEnd"/>
-      <w:r>
-        <w:rPr>
-          <w:color w:val="45B0E1" w:themeColor="accent1" w:themeTint="99"/>
-          <w:sz w:val="12"/>
-          <w:szCs w:val="12"/>
-          <w:lang w:val="en-US"/>
-        </w:rPr>
-        <w:t xml:space="preserve"> = </w:t>
-      </w:r>
-      <w:r>
-        <w:rPr>
-          <w:color w:val="45B0E1" w:themeColor="accent1" w:themeTint="99"/>
-          <w:sz w:val="12"/>
-          <w:szCs w:val="12"/>
-          <w:lang w:val="en-US"/>
-        </w:rPr>
-        <w:t>[</w:t>
-      </w:r>
-      <w:r>
-        <w:rPr>
-          <w:color w:val="45B0E1" w:themeColor="accent1" w:themeTint="99"/>
-          <w:sz w:val="12"/>
-          <w:szCs w:val="12"/>
-          <w:lang w:val="en-US"/>
-        </w:rPr>
-        <w:t>100.0, 100.0, 100.0, 100.0, 100.0, 100.0, 100.0, 100.0, 100.0, 100.0</w:t>
-      </w:r>
-      <w:r>
-        <w:rPr>
-          <w:color w:val="45B0E1" w:themeColor="accent1" w:themeTint="99"/>
-          <w:sz w:val="12"/>
-          <w:szCs w:val="12"/>
-          <w:lang w:val="en-US"/>
-        </w:rPr>
-        <w:t>]</w:t>
-      </w:r>
-    </w:p>
-    <w:p>
-      <w:pPr>
-        <w:rPr>
-          <w:color w:val="45B0E1" w:themeColor="accent1" w:themeTint="99"/>
-          <w:sz w:val="12"/>
-          <w:szCs w:val="12"/>
-          <w:lang w:val="en-US"/>
-        </w:rPr>
-      </w:pPr>
-      <w:proofErr w:type="spellStart"/>
-      <w:r>
-        <w:rPr>
-          <w:color w:val="45B0E1" w:themeColor="accent1" w:themeTint="99"/>
-          <w:sz w:val="12"/>
-          <w:szCs w:val="12"/>
-          <w:lang w:val="en-US"/>
-        </w:rPr>
-        <w:t>occupancy_adj_json</w:t>
-      </w:r>
-      <w:proofErr w:type="spellEnd"/>
-      <w:r>
-        <w:rPr>
-          <w:color w:val="45B0E1" w:themeColor="accent1" w:themeTint="99"/>
-          <w:sz w:val="12"/>
-          <w:szCs w:val="12"/>
-          <w:lang w:val="en-US"/>
-        </w:rPr>
-        <w:t xml:space="preserve"> = </w:t>
-      </w:r>
-      <w:r>
-        <w:rPr>
-          <w:color w:val="45B0E1" w:themeColor="accent1" w:themeTint="99"/>
-          <w:sz w:val="12"/>
-          <w:szCs w:val="12"/>
-          <w:lang w:val="en-US"/>
-        </w:rPr>
-        <w:t>[</w:t>
-      </w:r>
-      <w:r>
-        <w:rPr>
-          <w:color w:val="45B0E1" w:themeColor="accent1" w:themeTint="99"/>
-          <w:sz w:val="12"/>
-          <w:szCs w:val="12"/>
-          <w:lang w:val="en-US"/>
-        </w:rPr>
-        <w:t>100.0, 100.0, 100.0, 100.0, 100.0, 100.0, 100.0, 100.0, 100.0, 100.0</w:t>
-      </w:r>
-      <w:r>
-        <w:rPr>
-          <w:color w:val="45B0E1" w:themeColor="accent1" w:themeTint="99"/>
-          <w:sz w:val="12"/>
-          <w:szCs w:val="12"/>
-          <w:lang w:val="en-US"/>
-        </w:rPr>
-        <w:t>]</w:t>
-      </w:r>
-    </w:p>
-    <w:p>
-      <w:pPr>
-        <w:rPr>
-          <w:color w:val="45B0E1" w:themeColor="accent1" w:themeTint="99"/>
-          <w:sz w:val="12"/>
-          <w:szCs w:val="12"/>
-          <w:lang w:val="en-US"/>
-        </w:rPr>
-      </w:pPr>
-      <w:proofErr w:type="spellStart"/>
-      <w:r>
-        <w:rPr>
-          <w:color w:val="45B0E1" w:themeColor="accent1" w:themeTint="99"/>
-          <w:sz w:val="12"/>
-          <w:szCs w:val="12"/>
-          <w:lang w:val="en-US"/>
-        </w:rPr>
-        <w:t>occupancy_adj_txt</w:t>
-      </w:r>
-      <w:proofErr w:type="spellEnd"/>
-      <w:r>
-        <w:rPr>
-          <w:color w:val="45B0E1" w:themeColor="accent1" w:themeTint="99"/>
-          <w:sz w:val="12"/>
-          <w:szCs w:val="12"/>
-          <w:lang w:val="en-US"/>
-        </w:rPr>
-        <w:t xml:space="preserve"> = </w:t>
-      </w:r>
-      <w:r>
-        <w:rPr>
-          <w:color w:val="45B0E1" w:themeColor="accent1" w:themeTint="99"/>
-          <w:sz w:val="12"/>
-          <w:szCs w:val="12"/>
-          <w:lang w:val="en-US"/>
-        </w:rPr>
-        <w:t>[</w:t>
-      </w:r>
-      <w:r>
-        <w:rPr>
-          <w:color w:val="45B0E1" w:themeColor="accent1" w:themeTint="99"/>
-          <w:sz w:val="12"/>
-          <w:szCs w:val="12"/>
-          <w:lang w:val="en-US"/>
-        </w:rPr>
-        <w:t>100.0, 100.0, 100.0, 100.0, 100.0, 100.0, 100.0, 100.0, 100.0, 100.0</w:t>
-      </w:r>
-      <w:r>
-        <w:rPr>
-          <w:color w:val="45B0E1" w:themeColor="accent1" w:themeTint="99"/>
-          <w:sz w:val="12"/>
-          <w:szCs w:val="12"/>
-          <w:lang w:val="en-US"/>
-        </w:rPr>
-        <w:t>]</w:t>
-      </w:r>
-    </w:p>
-    <w:p>
-      <w:pPr>
-        <w:rPr>
-          <w:sz w:val="12"/>
-          <w:szCs w:val="12"/>
-        </w:rPr>
-      </w:pPr>
-      <w:proofErr w:type="spellStart"/>
-      <w:r>
-        <w:rPr>
-          <w:sz w:val="12"/>
-          <w:szCs w:val="12"/>
-        </w:rPr>
-        <w:t>occupancy_ascii_txt</w:t>
-      </w:r>
-      <w:proofErr w:type="spellEnd"/>
-      <w:r>
-        <w:rPr>
-          <w:sz w:val="12"/>
-          <w:szCs w:val="12"/>
-        </w:rPr>
-        <w:t xml:space="preserve"> = </w:t>
-      </w:r>
-      <w:r>
-        <w:rPr>
-          <w:sz w:val="12"/>
-          <w:szCs w:val="12"/>
-        </w:rPr>
-        <w:t>[</w:t>
-      </w:r>
-      <w:r>
-        <w:rPr>
-          <w:color w:val="EE0000"/>
-          <w:sz w:val="12"/>
-          <w:szCs w:val="12"/>
-        </w:rPr>
-        <w:t xml:space="preserve">22.22222222222222, </w:t>
-      </w:r>
-      <w:r>
-        <w:rPr>
-          <w:sz w:val="12"/>
-          <w:szCs w:val="12"/>
-        </w:rPr>
-        <w:t xml:space="preserve">100.0, 100.0, 100.0, 100.0, 100.0, 100.0, 100.0, </w:t>
-      </w:r>
-      <w:r>
-        <w:rPr>
-          <w:color w:val="EE0000"/>
-          <w:sz w:val="12"/>
-          <w:szCs w:val="12"/>
-        </w:rPr>
-        <w:t>46.15384615384615, 77.77777777777779</w:t>
-      </w:r>
-      <w:r>
-        <w:rPr>
-          <w:sz w:val="12"/>
-          <w:szCs w:val="12"/>
-        </w:rPr>
-        <w:t>]</w:t>
-      </w:r>
-      <w:r>
-        <w:rPr>
-          <w:sz w:val="12"/>
-          <w:szCs w:val="12"/>
-        </w:rPr>
-        <w:t xml:space="preserve"> </w:t>
-      </w:r>
-      <w:r>
-        <w:rPr>
           <w:sz w:val="12"/>
           <w:szCs w:val="12"/>
         </w:rPr>
@@ -2652,16 +2396,7 @@
           <w:u w:val="single"/>
         </w:rPr>
         <w:br/>
-        <w:t xml:space="preserve">Run 9: </w:t>
-      </w:r>
-      <w:r>
-        <w:rPr>
-          <w:color w:val="EE0000"/>
-          <w:sz w:val="8"/>
-          <w:szCs w:val="8"/>
-          <w:u w:val="single"/>
-        </w:rPr>
-        <w:t xml:space="preserve">Heeft het bijna goed gedaan, maar doet het wel echt fout. Er is 1 </w:t>
+        <w:t xml:space="preserve">Run 9: Heeft het bijna goed gedaan, maar doet het wel echt fout. Er is 1 </w:t>
       </w:r>
       <w:proofErr w:type="spellStart"/>
       <w:r>
@@ -2701,16 +2436,7 @@
           <w:szCs w:val="8"/>
           <w:u w:val="single"/>
         </w:rPr>
-        <w:t>-break.</w:t>
-      </w:r>
-      <w:r>
-        <w:rPr>
-          <w:color w:val="EE0000"/>
-          <w:sz w:val="8"/>
-          <w:szCs w:val="8"/>
-          <w:u w:val="single"/>
-        </w:rPr>
-        <w:t xml:space="preserve"> Doet hetzelfde als R-allo run 5 (</w:t>
+        <w:t>-break. Doet hetzelfde als R-allo run 5 (</w:t>
       </w:r>
       <w:proofErr w:type="spellStart"/>
       <w:r>
@@ -2778,6 +2504,7 @@
           <w:sz w:val="12"/>
           <w:szCs w:val="12"/>
           <w:u w:val="single"/>
+          <w:lang w:val="en-US"/>
         </w:rPr>
       </w:pPr>
       <w:proofErr w:type="spellStart"/>
@@ -2895,35 +2622,17 @@
           <w:szCs w:val="8"/>
           <w:u w:val="single"/>
         </w:rPr>
-        <w:t xml:space="preserve">Run 2: </w:t>
-      </w:r>
-      <w:r>
-        <w:rPr>
-          <w:color w:val="EE0000"/>
-          <w:sz w:val="8"/>
-          <w:szCs w:val="8"/>
-          <w:u w:val="single"/>
-        </w:rPr>
-        <w:t xml:space="preserve">begin/eind goed </w:t>
-      </w:r>
-      <w:proofErr w:type="spellStart"/>
-      <w:r>
-        <w:rPr>
-          <w:color w:val="EE0000"/>
-          <w:sz w:val="8"/>
-          <w:szCs w:val="8"/>
-          <w:u w:val="single"/>
-        </w:rPr>
-        <w:t>geidenti</w:t>
-      </w:r>
-      <w:r>
-        <w:rPr>
-          <w:color w:val="EE0000"/>
-          <w:sz w:val="8"/>
-          <w:szCs w:val="8"/>
-          <w:u w:val="single"/>
-        </w:rPr>
-        <w:t>ficeerd</w:t>
+        <w:t xml:space="preserve">Run 2: begin/eind goed </w:t>
+      </w:r>
+      <w:proofErr w:type="spellStart"/>
+      <w:r>
+        <w:rPr>
+          <w:color w:val="EE0000"/>
+          <w:sz w:val="8"/>
+          <w:szCs w:val="8"/>
+          <w:u w:val="single"/>
+        </w:rPr>
+        <w:t>geidentificeerd</w:t>
       </w:r>
       <w:proofErr w:type="spellEnd"/>
       <w:r>
@@ -3369,23 +3078,101 @@
           <w:szCs w:val="8"/>
           <w:u w:val="single"/>
         </w:rPr>
-        <w:t xml:space="preserve"> perfect, noemt het ook een spiraal. Vindt het juiste pad. Dan OPEENS vindt hij ook een ander (incorrect) pad, en noemt die ook valide. Kiest die niet als eindantwoord. </w:t>
-      </w:r>
-    </w:p>
-    <w:p>
-      <w:pPr>
-        <w:rPr>
-          <w:color w:val="45B0E1" w:themeColor="accent1" w:themeTint="99"/>
-          <w:sz w:val="12"/>
-          <w:szCs w:val="12"/>
-        </w:rPr>
-      </w:pPr>
-      <w:proofErr w:type="spellStart"/>
-      <w:r>
-        <w:rPr>
-          <w:color w:val="45B0E1" w:themeColor="accent1" w:themeTint="99"/>
-          <w:sz w:val="12"/>
-          <w:szCs w:val="12"/>
+        <w:t xml:space="preserve"> perfect, noemt het ook een spiraal. Vindt het juiste pad. Dan OPEENS vindt hij ook een ander (incorrect) pad, en noemt die ook valide. </w:t>
+      </w:r>
+      <w:r>
+        <w:rPr>
+          <w:color w:val="EE0000"/>
+          <w:sz w:val="8"/>
+          <w:szCs w:val="8"/>
+          <w:u w:val="single"/>
+          <w:lang w:val="en-US"/>
+        </w:rPr>
+        <w:t xml:space="preserve">Kiest die </w:t>
+      </w:r>
+      <w:proofErr w:type="spellStart"/>
+      <w:r>
+        <w:rPr>
+          <w:color w:val="EE0000"/>
+          <w:sz w:val="8"/>
+          <w:szCs w:val="8"/>
+          <w:u w:val="single"/>
+          <w:lang w:val="en-US"/>
+        </w:rPr>
+        <w:t>niet</w:t>
+      </w:r>
+      <w:proofErr w:type="spellEnd"/>
+      <w:r>
+        <w:rPr>
+          <w:color w:val="EE0000"/>
+          <w:sz w:val="8"/>
+          <w:szCs w:val="8"/>
+          <w:u w:val="single"/>
+          <w:lang w:val="en-US"/>
+        </w:rPr>
+        <w:t xml:space="preserve"> </w:t>
+      </w:r>
+      <w:proofErr w:type="spellStart"/>
+      <w:r>
+        <w:rPr>
+          <w:color w:val="EE0000"/>
+          <w:sz w:val="8"/>
+          <w:szCs w:val="8"/>
+          <w:u w:val="single"/>
+          <w:lang w:val="en-US"/>
+        </w:rPr>
+        <w:t>als</w:t>
+      </w:r>
+      <w:proofErr w:type="spellEnd"/>
+      <w:r>
+        <w:rPr>
+          <w:color w:val="EE0000"/>
+          <w:sz w:val="8"/>
+          <w:szCs w:val="8"/>
+          <w:u w:val="single"/>
+          <w:lang w:val="en-US"/>
+        </w:rPr>
+        <w:t xml:space="preserve"> </w:t>
+      </w:r>
+      <w:proofErr w:type="spellStart"/>
+      <w:r>
+        <w:rPr>
+          <w:color w:val="EE0000"/>
+          <w:sz w:val="8"/>
+          <w:szCs w:val="8"/>
+          <w:u w:val="single"/>
+          <w:lang w:val="en-US"/>
+        </w:rPr>
+        <w:t>eindantwoord</w:t>
+      </w:r>
+      <w:proofErr w:type="spellEnd"/>
+      <w:r>
+        <w:rPr>
+          <w:color w:val="EE0000"/>
+          <w:sz w:val="8"/>
+          <w:szCs w:val="8"/>
+          <w:u w:val="single"/>
+          <w:lang w:val="en-US"/>
+        </w:rPr>
+        <w:t xml:space="preserve">. </w:t>
+      </w:r>
+    </w:p>
+    <w:p>
+      <w:pPr>
+        <w:rPr>
+          <w:color w:val="45B0E1" w:themeColor="accent1" w:themeTint="99"/>
+          <w:sz w:val="12"/>
+          <w:szCs w:val="12"/>
+          <w:lang w:val="en-US"/>
+        </w:rPr>
+      </w:pPr>
+      <w:proofErr w:type="spellStart"/>
+      <w:r>
+        <w:rPr>
+          <w:color w:val="45B0E1" w:themeColor="accent1" w:themeTint="99"/>
+          <w:sz w:val="12"/>
+          <w:szCs w:val="12"/>
+          <w:lang w:val="en-US"/>
         </w:rPr>
         <w:t>occupancy_json</w:t>
       </w:r>
@@ -3395,32 +3182,9 @@
           <w:color w:val="45B0E1" w:themeColor="accent1" w:themeTint="99"/>
           <w:sz w:val="12"/>
           <w:szCs w:val="12"/>
-        </w:rPr>
-        <w:t xml:space="preserve"> = </w:t>
-      </w:r>
-      <w:r>
-        <w:rPr>
-          <w:color w:val="45B0E1" w:themeColor="accent1" w:themeTint="99"/>
-          <w:sz w:val="12"/>
-          <w:szCs w:val="12"/>
-        </w:rPr>
-        <w:t>[</w:t>
-      </w:r>
-      <w:r>
-        <w:rPr>
-          <w:color w:val="45B0E1" w:themeColor="accent1" w:themeTint="99"/>
-          <w:sz w:val="12"/>
-          <w:szCs w:val="12"/>
-        </w:rPr>
-        <w:t>100.0, 100.0, 100.0, 100.0, 100.0, 100.0, 100.0, 100.0, 100.0, 100.0</w:t>
-      </w:r>
-      <w:r>
-        <w:rPr>
-          <w:color w:val="45B0E1" w:themeColor="accent1" w:themeTint="99"/>
-          <w:sz w:val="12"/>
-          <w:szCs w:val="12"/>
-        </w:rPr>
-        <w:t>]</w:t>
+          <w:lang w:val="en-US"/>
+        </w:rPr>
+        <w:t xml:space="preserve"> = [100.0, 100.0, 100.0, 100.0, 100.0, 100.0, 100.0, 100.0, 100.0, 100.0]</w:t>
       </w:r>
     </w:p>
     <w:p>
@@ -3973,16 +3737,7 @@
           <w:szCs w:val="8"/>
           <w:u w:val="single"/>
         </w:rPr>
-        <w:t xml:space="preserve">Run 6: </w:t>
-      </w:r>
-      <w:r>
-        <w:rPr>
-          <w:color w:val="EE0000"/>
-          <w:sz w:val="8"/>
-          <w:szCs w:val="8"/>
-          <w:u w:val="single"/>
-        </w:rPr>
-        <w:t xml:space="preserve">hallucineert een andere </w:t>
+        <w:t xml:space="preserve">Run 6: hallucineert een andere </w:t>
       </w:r>
       <w:proofErr w:type="spellStart"/>
       <w:r>
@@ -4002,25 +3757,7 @@
           <w:szCs w:val="8"/>
           <w:u w:val="single"/>
         </w:rPr>
-        <w:t xml:space="preserve">, legt die muren en eindpunt uit, en lost die dan </w:t>
-      </w:r>
-      <w:r>
-        <w:rPr>
-          <w:color w:val="EE0000"/>
-          <w:sz w:val="8"/>
-          <w:szCs w:val="8"/>
-          <w:u w:val="single"/>
-        </w:rPr>
-        <w:t>verkeerd</w:t>
-      </w:r>
-      <w:r>
-        <w:rPr>
-          <w:color w:val="EE0000"/>
-          <w:sz w:val="8"/>
-          <w:szCs w:val="8"/>
-          <w:u w:val="single"/>
-        </w:rPr>
-        <w:t xml:space="preserve"> op.</w:t>
+        <w:t>, legt die muren en eindpunt uit, en lost die dan verkeerd op.</w:t>
       </w:r>
       <w:r>
         <w:rPr>
@@ -4121,16 +3858,7 @@
           <w:szCs w:val="8"/>
           <w:u w:val="single"/>
         </w:rPr>
-        <w:t xml:space="preserve">Run 10: </w:t>
-      </w:r>
-      <w:r>
-        <w:rPr>
-          <w:color w:val="EE0000"/>
-          <w:sz w:val="8"/>
-          <w:szCs w:val="8"/>
-          <w:u w:val="single"/>
-        </w:rPr>
-        <w:t xml:space="preserve">hallucineert een andere </w:t>
+        <w:t xml:space="preserve">Run 10: hallucineert een andere </w:t>
       </w:r>
       <w:proofErr w:type="spellStart"/>
       <w:r>
@@ -4216,16 +3944,14 @@
           <w:color w:val="45B0E1" w:themeColor="accent1" w:themeTint="99"/>
           <w:sz w:val="12"/>
           <w:szCs w:val="12"/>
-          <w:lang w:val="en-US"/>
-        </w:rPr>
-      </w:pPr>
-      <w:proofErr w:type="spellStart"/>
-      <w:r>
-        <w:rPr>
-          <w:color w:val="45B0E1" w:themeColor="accent1" w:themeTint="99"/>
-          <w:sz w:val="12"/>
-          <w:szCs w:val="12"/>
-          <w:lang w:val="en-US"/>
+        </w:rPr>
+      </w:pPr>
+      <w:proofErr w:type="spellStart"/>
+      <w:r>
+        <w:rPr>
+          <w:color w:val="45B0E1" w:themeColor="accent1" w:themeTint="99"/>
+          <w:sz w:val="12"/>
+          <w:szCs w:val="12"/>
         </w:rPr>
         <w:t>line_tokenized_txt</w:t>
       </w:r>
@@ -4235,36 +3961,8 @@
           <w:color w:val="45B0E1" w:themeColor="accent1" w:themeTint="99"/>
           <w:sz w:val="12"/>
           <w:szCs w:val="12"/>
-          <w:lang w:val="en-US"/>
-        </w:rPr>
-        <w:t xml:space="preserve"> = </w:t>
-      </w:r>
-      <w:r>
-        <w:rPr>
-          <w:color w:val="45B0E1" w:themeColor="accent1" w:themeTint="99"/>
-          <w:sz w:val="12"/>
-          <w:szCs w:val="12"/>
-          <w:lang w:val="en-US"/>
-        </w:rPr>
-        <w:t>[</w:t>
-      </w:r>
-      <w:r>
-        <w:rPr>
-          <w:color w:val="45B0E1" w:themeColor="accent1" w:themeTint="99"/>
-          <w:sz w:val="12"/>
-          <w:szCs w:val="12"/>
-          <w:lang w:val="en-US"/>
-        </w:rPr>
-        <w:t>100.0, 100.0, 100.0, 100.0, 100.0, 100.0, 100.0, 100.0, 100.0, 100.0</w:t>
-      </w:r>
-      <w:r>
-        <w:rPr>
-          <w:color w:val="45B0E1" w:themeColor="accent1" w:themeTint="99"/>
-          <w:sz w:val="12"/>
-          <w:szCs w:val="12"/>
-          <w:lang w:val="en-US"/>
-        </w:rPr>
-        <w:t>]</w:t>
+        </w:rPr>
+        <w:t xml:space="preserve"> = [100.0, 100.0, 100.0, 100.0, 100.0, 100.0, 100.0, 100.0, 100.0, 100.0]</w:t>
       </w:r>
     </w:p>
     <w:p>
@@ -4509,13 +4207,15 @@
         <w:rPr>
           <w:sz w:val="12"/>
           <w:szCs w:val="12"/>
-        </w:rPr>
-      </w:pPr>
-      <w:proofErr w:type="spellStart"/>
-      <w:r>
-        <w:rPr>
-          <w:sz w:val="12"/>
-          <w:szCs w:val="12"/>
+          <w:lang w:val="en-US"/>
+        </w:rPr>
+      </w:pPr>
+      <w:proofErr w:type="spellStart"/>
+      <w:r>
+        <w:rPr>
+          <w:sz w:val="12"/>
+          <w:szCs w:val="12"/>
+          <w:lang w:val="en-US"/>
         </w:rPr>
         <w:t>occupancy_jpg</w:t>
       </w:r>
@@ -4524,29 +4224,9 @@
         <w:rPr>
           <w:sz w:val="12"/>
           <w:szCs w:val="12"/>
-        </w:rPr>
-        <w:t xml:space="preserve"> = </w:t>
-      </w:r>
-      <w:r>
-        <w:rPr>
-          <w:sz w:val="12"/>
-          <w:szCs w:val="12"/>
-        </w:rPr>
-        <w:t>[</w:t>
-      </w:r>
-      <w:r>
-        <w:rPr>
-          <w:sz w:val="12"/>
-          <w:szCs w:val="12"/>
-        </w:rPr>
-        <w:t>0.0, 0.0, 0.0, 50.0, 0.0, 0.0, 25.0, 16.666666666666664, 0.0, 37.5</w:t>
-      </w:r>
-      <w:r>
-        <w:rPr>
-          <w:sz w:val="12"/>
-          <w:szCs w:val="12"/>
-        </w:rPr>
-        <w:t>]</w:t>
+          <w:lang w:val="en-US"/>
+        </w:rPr>
+        <w:t xml:space="preserve"> = [0.0, 0.0, 0.0, 50.0, 0.0, 0.0, 25.0, 16.666666666666664, 0.0, 37.5]</w:t>
       </w:r>
     </w:p>
     <w:p>
@@ -4714,7 +4394,6 @@
           <w:bCs/>
           <w:sz w:val="12"/>
           <w:szCs w:val="12"/>
-          <w:lang w:val="en-US"/>
         </w:rPr>
       </w:pPr>
       <w:r>
@@ -4723,8 +4402,8 @@
           <w:bCs/>
           <w:sz w:val="12"/>
           <w:szCs w:val="12"/>
-          <w:lang w:val="en-US"/>
-        </w:rPr>
+        </w:rPr>
+        <w:lastRenderedPageBreak/>
         <w:t xml:space="preserve">R - EGO </w:t>
       </w:r>
     </w:p>
@@ -4907,7 +4586,6 @@
           <w:szCs w:val="12"/>
           <w:lang w:val="en-US"/>
         </w:rPr>
-        <w:lastRenderedPageBreak/>
         <w:t>line_jpg</w:t>
       </w:r>
       <w:proofErr w:type="spellEnd"/>
@@ -4917,10 +4595,41 @@
           <w:szCs w:val="12"/>
           <w:lang w:val="en-US"/>
         </w:rPr>
+        <w:t xml:space="preserve"> = [25.0, 0.0, 50.0, 50.0, 33.33333333333333, 0.0, 0.0, 100.0, 16.666666666666664, 110.00000000000001]</w:t>
+      </w:r>
+    </w:p>
+    <w:p>
+      <w:pPr>
+        <w:rPr>
+          <w:color w:val="45B0E1" w:themeColor="accent1" w:themeTint="99"/>
+          <w:sz w:val="12"/>
+          <w:szCs w:val="12"/>
+          <w:lang w:val="en-US"/>
+        </w:rPr>
+      </w:pPr>
+      <w:proofErr w:type="spellStart"/>
+      <w:r>
+        <w:rPr>
+          <w:color w:val="45B0E1" w:themeColor="accent1" w:themeTint="99"/>
+          <w:sz w:val="12"/>
+          <w:szCs w:val="12"/>
+          <w:lang w:val="en-US"/>
+        </w:rPr>
+        <w:t>line_json</w:t>
+      </w:r>
+      <w:proofErr w:type="spellEnd"/>
+      <w:r>
+        <w:rPr>
+          <w:color w:val="45B0E1" w:themeColor="accent1" w:themeTint="99"/>
+          <w:sz w:val="12"/>
+          <w:szCs w:val="12"/>
+          <w:lang w:val="en-US"/>
+        </w:rPr>
         <w:t xml:space="preserve"> = </w:t>
       </w:r>
       <w:r>
         <w:rPr>
+          <w:color w:val="45B0E1" w:themeColor="accent1" w:themeTint="99"/>
           <w:sz w:val="12"/>
           <w:szCs w:val="12"/>
           <w:lang w:val="en-US"/>
@@ -4929,14 +4638,16 @@
       </w:r>
       <w:r>
         <w:rPr>
-          <w:sz w:val="12"/>
-          <w:szCs w:val="12"/>
-          <w:lang w:val="en-US"/>
-        </w:rPr>
-        <w:t>25.0, 0.0, 50.0, 50.0, 33.33333333333333, 0.0, 0.0, 100.0, 16.666666666666664, 110.00000000000001</w:t>
-      </w:r>
-      <w:r>
-        <w:rPr>
+          <w:color w:val="45B0E1" w:themeColor="accent1" w:themeTint="99"/>
+          <w:sz w:val="12"/>
+          <w:szCs w:val="12"/>
+          <w:lang w:val="en-US"/>
+        </w:rPr>
+        <w:t>100.0, 100.0, 100.0, 100.0, 100.0, 100.0, 100.0, 100.0, 100.0, 100.0</w:t>
+      </w:r>
+      <w:r>
+        <w:rPr>
+          <w:color w:val="45B0E1" w:themeColor="accent1" w:themeTint="99"/>
           <w:sz w:val="12"/>
           <w:szCs w:val="12"/>
           <w:lang w:val="en-US"/>
@@ -4961,7 +4672,7 @@
           <w:szCs w:val="12"/>
           <w:lang w:val="en-US"/>
         </w:rPr>
-        <w:t>line_json</w:t>
+        <w:t>line_tokenized_txt</w:t>
       </w:r>
       <w:proofErr w:type="spellEnd"/>
       <w:r>
@@ -5018,7 +4729,7 @@
           <w:szCs w:val="12"/>
           <w:lang w:val="en-US"/>
         </w:rPr>
-        <w:t>line_tokenized_txt</w:t>
+        <w:t>occupancy_adj_json</w:t>
       </w:r>
       <w:proofErr w:type="spellEnd"/>
       <w:r>
@@ -5075,7 +4786,7 @@
           <w:szCs w:val="12"/>
           <w:lang w:val="en-US"/>
         </w:rPr>
-        <w:t>occupancy_adj_json</w:t>
+        <w:t>occupancy_adj_txt</w:t>
       </w:r>
       <w:proofErr w:type="spellEnd"/>
       <w:r>
@@ -5118,136 +4829,63 @@
     <w:p>
       <w:pPr>
         <w:rPr>
-          <w:color w:val="45B0E1" w:themeColor="accent1" w:themeTint="99"/>
-          <w:sz w:val="12"/>
-          <w:szCs w:val="12"/>
-          <w:lang w:val="en-US"/>
-        </w:rPr>
-      </w:pPr>
-      <w:proofErr w:type="spellStart"/>
-      <w:r>
-        <w:rPr>
-          <w:color w:val="45B0E1" w:themeColor="accent1" w:themeTint="99"/>
-          <w:sz w:val="12"/>
-          <w:szCs w:val="12"/>
-          <w:lang w:val="en-US"/>
-        </w:rPr>
-        <w:t>occupancy_adj_txt</w:t>
-      </w:r>
-      <w:proofErr w:type="spellEnd"/>
-      <w:r>
-        <w:rPr>
-          <w:color w:val="45B0E1" w:themeColor="accent1" w:themeTint="99"/>
-          <w:sz w:val="12"/>
-          <w:szCs w:val="12"/>
-          <w:lang w:val="en-US"/>
-        </w:rPr>
-        <w:t xml:space="preserve"> = </w:t>
-      </w:r>
-      <w:r>
-        <w:rPr>
-          <w:color w:val="45B0E1" w:themeColor="accent1" w:themeTint="99"/>
-          <w:sz w:val="12"/>
-          <w:szCs w:val="12"/>
-          <w:lang w:val="en-US"/>
-        </w:rPr>
-        <w:t>[</w:t>
-      </w:r>
-      <w:r>
-        <w:rPr>
-          <w:color w:val="45B0E1" w:themeColor="accent1" w:themeTint="99"/>
-          <w:sz w:val="12"/>
-          <w:szCs w:val="12"/>
-          <w:lang w:val="en-US"/>
-        </w:rPr>
-        <w:t>100.0, 100.0, 100.0, 100.0, 100.0, 100.0, 100.0, 100.0, 100.0, 100.0</w:t>
-      </w:r>
-      <w:r>
-        <w:rPr>
-          <w:color w:val="45B0E1" w:themeColor="accent1" w:themeTint="99"/>
+          <w:color w:val="EE0000"/>
+          <w:sz w:val="12"/>
+          <w:szCs w:val="12"/>
+        </w:rPr>
+      </w:pPr>
+      <w:proofErr w:type="spellStart"/>
+      <w:r>
+        <w:rPr>
+          <w:sz w:val="12"/>
+          <w:szCs w:val="12"/>
+          <w:lang w:val="en-US"/>
+        </w:rPr>
+        <w:t>occupancy_ascii_txt</w:t>
+      </w:r>
+      <w:proofErr w:type="spellEnd"/>
+      <w:r>
+        <w:rPr>
+          <w:sz w:val="12"/>
+          <w:szCs w:val="12"/>
+          <w:lang w:val="en-US"/>
+        </w:rPr>
+        <w:t xml:space="preserve"> = [100.0, 100.0, 100.0, 100.0, 100.0, 100.0, </w:t>
+      </w:r>
+      <w:r>
+        <w:rPr>
+          <w:color w:val="EE0000"/>
+          <w:sz w:val="12"/>
+          <w:szCs w:val="12"/>
+          <w:lang w:val="en-US"/>
+        </w:rPr>
+        <w:t>50.0</w:t>
+      </w:r>
+      <w:r>
+        <w:rPr>
+          <w:sz w:val="12"/>
+          <w:szCs w:val="12"/>
+          <w:lang w:val="en-US"/>
+        </w:rPr>
+        <w:t xml:space="preserve">, 100.0, 100.0, </w:t>
+      </w:r>
+      <w:r>
+        <w:rPr>
+          <w:color w:val="EE0000"/>
+          <w:sz w:val="12"/>
+          <w:szCs w:val="12"/>
+          <w:lang w:val="en-US"/>
+        </w:rPr>
+        <w:t>75.0</w:t>
+      </w:r>
+      <w:r>
+        <w:rPr>
           <w:sz w:val="12"/>
           <w:szCs w:val="12"/>
           <w:lang w:val="en-US"/>
         </w:rPr>
         <w:t>]</w:t>
       </w:r>
-    </w:p>
-    <w:p>
-      <w:pPr>
-        <w:rPr>
-          <w:color w:val="EE0000"/>
-          <w:sz w:val="12"/>
-          <w:szCs w:val="12"/>
-        </w:rPr>
-      </w:pPr>
-      <w:proofErr w:type="spellStart"/>
-      <w:r>
-        <w:rPr>
-          <w:sz w:val="12"/>
-          <w:szCs w:val="12"/>
-          <w:lang w:val="en-US"/>
-        </w:rPr>
-        <w:t>occupancy_ascii_txt</w:t>
-      </w:r>
-      <w:proofErr w:type="spellEnd"/>
-      <w:r>
-        <w:rPr>
-          <w:sz w:val="12"/>
-          <w:szCs w:val="12"/>
-          <w:lang w:val="en-US"/>
-        </w:rPr>
-        <w:t xml:space="preserve"> = </w:t>
-      </w:r>
-      <w:r>
-        <w:rPr>
-          <w:sz w:val="12"/>
-          <w:szCs w:val="12"/>
-          <w:lang w:val="en-US"/>
-        </w:rPr>
-        <w:t>[</w:t>
-      </w:r>
-      <w:r>
-        <w:rPr>
-          <w:sz w:val="12"/>
-          <w:szCs w:val="12"/>
-          <w:lang w:val="en-US"/>
-        </w:rPr>
-        <w:t xml:space="preserve">100.0, 100.0, 100.0, 100.0, 100.0, 100.0, </w:t>
-      </w:r>
-      <w:r>
-        <w:rPr>
-          <w:color w:val="EE0000"/>
-          <w:sz w:val="12"/>
-          <w:szCs w:val="12"/>
-          <w:lang w:val="en-US"/>
-        </w:rPr>
-        <w:t>50.0</w:t>
-      </w:r>
-      <w:r>
-        <w:rPr>
-          <w:sz w:val="12"/>
-          <w:szCs w:val="12"/>
-          <w:lang w:val="en-US"/>
-        </w:rPr>
-        <w:t xml:space="preserve">, 100.0, 100.0, </w:t>
-      </w:r>
-      <w:r>
-        <w:rPr>
-          <w:color w:val="EE0000"/>
-          <w:sz w:val="12"/>
-          <w:szCs w:val="12"/>
-          <w:lang w:val="en-US"/>
-        </w:rPr>
-        <w:t>75.0</w:t>
-      </w:r>
-      <w:r>
-        <w:rPr>
-          <w:sz w:val="12"/>
-          <w:szCs w:val="12"/>
-          <w:lang w:val="en-US"/>
-        </w:rPr>
-        <w:t>]</w:t>
-      </w:r>
       <w:r>
         <w:rPr>
           <w:sz w:val="12"/>
@@ -5319,13 +4957,15 @@
         <w:rPr>
           <w:sz w:val="12"/>
           <w:szCs w:val="12"/>
-        </w:rPr>
-      </w:pPr>
-      <w:proofErr w:type="spellStart"/>
-      <w:r>
-        <w:rPr>
-          <w:sz w:val="12"/>
-          <w:szCs w:val="12"/>
+          <w:lang w:val="en-US"/>
+        </w:rPr>
+      </w:pPr>
+      <w:proofErr w:type="spellStart"/>
+      <w:r>
+        <w:rPr>
+          <w:sz w:val="12"/>
+          <w:szCs w:val="12"/>
+          <w:lang w:val="en-US"/>
         </w:rPr>
         <w:t>occupancy_jpg</w:t>
       </w:r>
@@ -5334,29 +4974,9 @@
         <w:rPr>
           <w:sz w:val="12"/>
           <w:szCs w:val="12"/>
-        </w:rPr>
-        <w:t xml:space="preserve"> = </w:t>
-      </w:r>
-      <w:r>
-        <w:rPr>
-          <w:sz w:val="12"/>
-          <w:szCs w:val="12"/>
-        </w:rPr>
-        <w:t>[</w:t>
-      </w:r>
-      <w:r>
-        <w:rPr>
-          <w:sz w:val="12"/>
-          <w:szCs w:val="12"/>
-        </w:rPr>
-        <w:t>12.5, 0.0, 0.0, 50.0, 33.33333333333333, 0.0, 12.5, 91.66666666666666, 8.333333333333332, 37.5</w:t>
-      </w:r>
-      <w:r>
-        <w:rPr>
-          <w:sz w:val="12"/>
-          <w:szCs w:val="12"/>
-        </w:rPr>
-        <w:t>]</w:t>
+          <w:lang w:val="en-US"/>
+        </w:rPr>
+        <w:t xml:space="preserve"> = [12.5, 0.0, 0.0, 50.0, 33.33333333333333, 0.0, 12.5, 91.66666666666666, 8.333333333333332, 37.5]</w:t>
       </w:r>
     </w:p>
     <w:p>
@@ -6195,6 +5815,7 @@
   <w:style w:type="character" w:default="1" w:styleId="DefaultParagraphFont">
     <w:name w:val="Default Paragraph Font"/>
     <w:uiPriority w:val="1"/>
+    <w:semiHidden/>
     <w:unhideWhenUsed/>
   </w:style>
   <w:style w:type="table" w:default="1" w:styleId="TableNormal">

</xml_diff>

<commit_message>
ran tests R allo 1-5
</commit_message>
<xml_diff>
--- a/3x3_score_investigation.docx
+++ b/3x3_score_investigation.docx
@@ -1353,7 +1353,6 @@
         <w:rPr>
           <w:sz w:val="12"/>
           <w:szCs w:val="12"/>
-          <w:u w:val="single"/>
         </w:rPr>
       </w:pPr>
       <w:proofErr w:type="spellStart"/>
@@ -1422,6 +1421,39 @@
           <w:sz w:val="12"/>
           <w:szCs w:val="12"/>
         </w:rPr>
+        <w:br/>
+      </w:r>
+      <w:r>
+        <w:rPr>
+          <w:sz w:val="12"/>
+          <w:szCs w:val="12"/>
+          <w:u w:val="single"/>
+        </w:rPr>
+        <w:t xml:space="preserve">Conclusie: ik weet niet echt of alle eerste stappen in dit geval echt tellen als een juiste stap. Ze lopen </w:t>
+      </w:r>
+      <w:proofErr w:type="spellStart"/>
+      <w:r>
+        <w:rPr>
+          <w:sz w:val="12"/>
+          <w:szCs w:val="12"/>
+          <w:u w:val="single"/>
+        </w:rPr>
+        <w:t>kringels</w:t>
+      </w:r>
+      <w:proofErr w:type="spellEnd"/>
+      <w:r>
+        <w:rPr>
+          <w:sz w:val="12"/>
+          <w:szCs w:val="12"/>
+          <w:u w:val="single"/>
+        </w:rPr>
+        <w:t xml:space="preserve"> die random ogen, allemaal meteen rechtsaf het vierkant uit. </w:t>
+      </w:r>
+      <w:r>
+        <w:rPr>
+          <w:sz w:val="12"/>
+          <w:szCs w:val="12"/>
+        </w:rPr>
         <w:t xml:space="preserve"> </w:t>
       </w:r>
       <w:r>
@@ -1471,6 +1503,14 @@
           <w:u w:val="single"/>
         </w:rPr>
         <w:t>komt vaker voor bij NR ego vgm).</w:t>
+      </w:r>
+      <w:r>
+        <w:rPr>
+          <w:sz w:val="12"/>
+          <w:szCs w:val="12"/>
+          <w:u w:val="single"/>
+        </w:rPr>
+        <w:t xml:space="preserve"> </w:t>
       </w:r>
       <w:r>
         <w:rPr>
@@ -1544,6 +1584,14 @@
           <w:szCs w:val="12"/>
           <w:u w:val="single"/>
         </w:rPr>
+        <w:t xml:space="preserve"> ** zelfde doolhof als 9.</w:t>
+      </w:r>
+      <w:r>
+        <w:rPr>
+          <w:sz w:val="12"/>
+          <w:szCs w:val="12"/>
+          <w:u w:val="single"/>
+        </w:rPr>
         <w:br/>
       </w:r>
       <w:r>
@@ -1585,7 +1633,23 @@
           <w:szCs w:val="12"/>
           <w:u w:val="single"/>
         </w:rPr>
-        <w:t xml:space="preserve">gel (die ik niet kan verklaren) direct het vierkant uit. </w:t>
+        <w:t>gel (die ik niet kan verklaren) direct het vierkant uit</w:t>
+      </w:r>
+      <w:r>
+        <w:rPr>
+          <w:sz w:val="12"/>
+          <w:szCs w:val="12"/>
+          <w:u w:val="single"/>
+        </w:rPr>
+        <w:t>, niet dezelfde kringel als bij run 5</w:t>
+      </w:r>
+      <w:r>
+        <w:rPr>
+          <w:sz w:val="12"/>
+          <w:szCs w:val="12"/>
+          <w:u w:val="single"/>
+        </w:rPr>
+        <w:t xml:space="preserve">. </w:t>
       </w:r>
     </w:p>
     <w:p>
@@ -1687,6 +1751,7 @@
           <w:szCs w:val="12"/>
           <w:lang w:val="en-US"/>
         </w:rPr>
+        <w:lastRenderedPageBreak/>
         <w:t>occupancy_jpg</w:t>
       </w:r>
       <w:proofErr w:type="spellEnd"/>
@@ -1733,7 +1798,6 @@
           <w:szCs w:val="12"/>
           <w:lang w:val="en-US"/>
         </w:rPr>
-        <w:lastRenderedPageBreak/>
         <w:t>occupancy_json</w:t>
       </w:r>
       <w:proofErr w:type="spellEnd"/>
@@ -4403,7 +4467,6 @@
           <w:sz w:val="12"/>
           <w:szCs w:val="12"/>
         </w:rPr>
-        <w:lastRenderedPageBreak/>
         <w:t xml:space="preserve">R - EGO </w:t>
       </w:r>
     </w:p>

</xml_diff>